<commit_message>
docs(weighbridge): detail 3 weigh types (NHẬP/XUẤT/CỔNG) in guide
Adds a "3 loại phiếu cân" section to the Phong Điền guide explaining NHẬP
(gross→tare), XUẤT (tare→gross, ties to sales order/dispatch), and CỔNG
(internal gate). Splits the steps into detailed intake (A) plus short export (B)
and gate (C) sections; now 12 image-placeholder boxes.

Co-Authored-By: Claude Opus 4.8 <noreply@anthropic.com>
</commit_message>
<xml_diff>
--- a/public/huong-dan-can-phong-dien.docx
+++ b/public/huong-dan-can-phong-dien.docx
@@ -84,7 +84,7 @@
           <w:sz w:val="22"/>
           <w:szCs w:val="22"/>
         </w:rPr>
-        <w:t xml:space="preserve">Mỗi xe vào = 1 phiếu cân. Cân 2 lần: lần 1 xe chở hàng, lần 2 xe rỗng.</w:t>
+        <w:t xml:space="preserve">Mỗi xe = 1 phiếu cân. Chọn ĐÚNG loại phiếu ngay từ đầu (xem 3 loại dưới).</w:t>
       </w:r>
     </w:p>
     <w:tbl>
@@ -147,7 +147,241 @@
           <w:sz w:val="28"/>
           <w:szCs w:val="28"/>
         </w:rPr>
-        <w:t xml:space="preserve">A. Cân NHẬP mủ (xe chở mủ vào)</w:t>
+        <w:t xml:space="preserve">3 loại phiếu cân — chọn đúng ngay từ đầu</w:t>
+      </w:r>
+    </w:p>
+    <w:tbl>
+      <w:tblPr>
+        <w:tblW w:w="9300" w:type="dxa"/>
+        <w:tblBorders>
+          <w:top w:val="dashed" w:sz="10" w:space="0" w:color="9CA3AF"/>
+          <w:left w:val="dashed" w:sz="10" w:space="0" w:color="9CA3AF"/>
+          <w:bottom w:val="dashed" w:sz="10" w:space="0" w:color="9CA3AF"/>
+          <w:right w:val="dashed" w:sz="10" w:space="0" w:color="9CA3AF"/>
+          <w:insideH w:val="dashed" w:sz="10" w:space="0" w:color="9CA3AF"/>
+          <w:insideV w:val="dashed" w:sz="10" w:space="0" w:color="9CA3AF"/>
+        </w:tblBorders>
+        <w:tblCellMar>
+          <w:top w:w="80" w:type="dxa"/>
+          <w:bottom w:w="80" w:type="dxa"/>
+        </w:tblCellMar>
+      </w:tblPr>
+      <w:tblGrid>
+        <w:gridCol w:w="9300"/>
+      </w:tblGrid>
+      <w:tr>
+        <w:trPr>
+          <w:trHeight w:val="1500"/>
+        </w:trPr>
+        <w:tc>
+          <w:tcPr>
+            <w:tcW w:w="9300" w:type="dxa"/>
+            <w:vAlign w:val="center"/>
+          </w:tcPr>
+          <w:p>
+            <w:pPr>
+              <w:jc w:val="center"/>
+              <w:spacing w:after="0"/>
+            </w:pPr>
+            <w:r>
+              <w:rPr>
+                <w:color w:val="9CA3AF"/>
+                <w:sz w:val="22"/>
+              </w:rPr>
+              <w:t xml:space="preserve">📷 Hình 2 — Thanh chọn loại phiếu: NHẬP · XUẤT · CỔNG</w:t>
+            </w:r>
+          </w:p>
+        </w:tc>
+      </w:tr>
+    </w:tbl>
+    <w:p>
+      <w:pPr>
+        <w:spacing w:after="160"/>
+      </w:pPr>
+    </w:p>
+    <w:p>
+      <w:pPr>
+        <w:ind w:left="120"/>
+        <w:spacing w:after="30" w:line="276" w:lineRule="auto"/>
+      </w:pPr>
+      <w:r>
+        <w:rPr>
+          <w:b/>
+          <w:color w:val="1B4D3E"/>
+          <w:sz w:val="24"/>
+          <w:szCs w:val="24"/>
+        </w:rPr>
+        <w:t xml:space="preserve">① NHẬP (vào kho) — cân mủ từ nhà cung cấp / đại lý vào kho</w:t>
+      </w:r>
+    </w:p>
+    <w:p>
+      <w:pPr>
+        <w:ind w:left="240"/>
+        <w:spacing w:after="80" w:line="276" w:lineRule="auto"/>
+      </w:pPr>
+      <w:r>
+        <w:rPr>
+          <w:b/>
+          <w:sz w:val="22"/>
+          <w:szCs w:val="22"/>
+        </w:rPr>
+        <w:t xml:space="preserve">• </w:t>
+      </w:r>
+      <w:r>
+        <w:rPr>
+          <w:sz w:val="22"/>
+          <w:szCs w:val="22"/>
+        </w:rPr>
+        <w:t xml:space="preserve">Cân 2 lần: Gross (xe + hàng) vào  →  Tare (xe rỗng) ra  →  Net = Gross − Tare = khối lượng mủ.</w:t>
+      </w:r>
+    </w:p>
+    <w:p>
+      <w:pPr>
+        <w:ind w:left="240"/>
+        <w:spacing w:after="80" w:line="276" w:lineRule="auto"/>
+      </w:pPr>
+      <w:r>
+        <w:rPr>
+          <w:b/>
+          <w:sz w:val="22"/>
+          <w:szCs w:val="22"/>
+        </w:rPr>
+        <w:t xml:space="preserve">• </w:t>
+      </w:r>
+      <w:r>
+        <w:rPr>
+          <w:sz w:val="22"/>
+          <w:szCs w:val="22"/>
+        </w:rPr>
+        <w:t xml:space="preserve">Có gắn nguồn mủ + loại mủ; riêng Mủ nước nhập thêm DRC để ra khối lượng khô.</w:t>
+      </w:r>
+    </w:p>
+    <w:p>
+      <w:pPr>
+        <w:ind w:left="120"/>
+        <w:spacing w:after="30" w:line="276" w:lineRule="auto"/>
+      </w:pPr>
+      <w:r>
+        <w:rPr>
+          <w:b/>
+          <w:color w:val="1B4D3E"/>
+          <w:sz w:val="24"/>
+          <w:szCs w:val="24"/>
+        </w:rPr>
+        <w:t xml:space="preserve">② XUẤT (ra kho) — cân hàng xuất đi cảng / khách</w:t>
+      </w:r>
+    </w:p>
+    <w:p>
+      <w:pPr>
+        <w:ind w:left="240"/>
+        <w:spacing w:after="80" w:line="276" w:lineRule="auto"/>
+      </w:pPr>
+      <w:r>
+        <w:rPr>
+          <w:b/>
+          <w:sz w:val="22"/>
+          <w:szCs w:val="22"/>
+        </w:rPr>
+        <w:t xml:space="preserve">• </w:t>
+      </w:r>
+      <w:r>
+        <w:rPr>
+          <w:sz w:val="22"/>
+          <w:szCs w:val="22"/>
+        </w:rPr>
+        <w:t xml:space="preserve">Cân 2 lần NGƯỢC với nhập: Tare (xe rỗng) vào  →  Gross (xe + hàng) ra  →  Net = Gross − Tare.</w:t>
+      </w:r>
+    </w:p>
+    <w:p>
+      <w:pPr>
+        <w:ind w:left="240"/>
+        <w:spacing w:after="80" w:line="276" w:lineRule="auto"/>
+      </w:pPr>
+      <w:r>
+        <w:rPr>
+          <w:b/>
+          <w:sz w:val="22"/>
+          <w:szCs w:val="22"/>
+        </w:rPr>
+        <w:t xml:space="preserve">• </w:t>
+      </w:r>
+      <w:r>
+        <w:rPr>
+          <w:sz w:val="22"/>
+          <w:szCs w:val="22"/>
+        </w:rPr>
+        <w:t xml:space="preserve">Gắn Đơn hàng bán / Container / Lệnh điều động. Xe chở nhiều loại mủ → chọn nhiều loại.</w:t>
+      </w:r>
+    </w:p>
+    <w:p>
+      <w:pPr>
+        <w:ind w:left="240"/>
+        <w:spacing w:after="80" w:line="276" w:lineRule="auto"/>
+      </w:pPr>
+      <w:r>
+        <w:rPr>
+          <w:b/>
+          <w:sz w:val="22"/>
+          <w:szCs w:val="22"/>
+        </w:rPr>
+        <w:t xml:space="preserve">• </w:t>
+      </w:r>
+      <w:r>
+        <w:rPr>
+          <w:sz w:val="22"/>
+          <w:szCs w:val="22"/>
+        </w:rPr>
+        <w:t xml:space="preserve">"Đã cân là được" — số cân gồm cả pallet / bao bì, KHÔNG so với kế hoạch.</w:t>
+      </w:r>
+    </w:p>
+    <w:p>
+      <w:pPr>
+        <w:ind w:left="120"/>
+        <w:spacing w:after="30" w:line="276" w:lineRule="auto"/>
+      </w:pPr>
+      <w:r>
+        <w:rPr>
+          <w:b/>
+          <w:color w:val="1B4D3E"/>
+          <w:sz w:val="24"/>
+          <w:szCs w:val="24"/>
+        </w:rPr>
+        <w:t xml:space="preserve">③ CỔNG (hàng nội bộ) — cân cổng cho hàng đi nội bộ</w:t>
+      </w:r>
+    </w:p>
+    <w:p>
+      <w:pPr>
+        <w:ind w:left="240"/>
+        <w:spacing w:after="80" w:line="276" w:lineRule="auto"/>
+      </w:pPr>
+      <w:r>
+        <w:rPr>
+          <w:b/>
+          <w:sz w:val="22"/>
+          <w:szCs w:val="22"/>
+        </w:rPr>
+        <w:t xml:space="preserve">• </w:t>
+      </w:r>
+      <w:r>
+        <w:rPr>
+          <w:sz w:val="22"/>
+          <w:szCs w:val="22"/>
+        </w:rPr>
+        <w:t xml:space="preserve">Cân vào  →  ra, chênh lệch = hàng. KHÔNG gắn nguồn mủ / deal / đơn hàng. (Chỉ dùng ở Phong Điền.)</w:t>
+      </w:r>
+    </w:p>
+    <w:p>
+      <w:pPr>
+        <w:spacing w:after="100" w:line="276" w:lineRule="auto"/>
+      </w:pPr>
+      <w:r>
+        <w:rPr>
+          <w:b/>
+          <w:color w:val="1B4D3E"/>
+          <w:sz w:val="28"/>
+          <w:szCs w:val="28"/>
+        </w:rPr>
+        <w:t xml:space="preserve">A. Các bước cân NHẬP (chi tiết)</w:t>
       </w:r>
     </w:p>
     <w:p>
@@ -169,7 +403,78 @@
           <w:sz w:val="26"/>
           <w:szCs w:val="26"/>
         </w:rPr>
-        <w:t xml:space="preserve">Tạo phiếu cân mới</w:t>
+        <w:t xml:space="preserve">Chọn loại phiếu = NHẬP (vào kho)</w:t>
+      </w:r>
+    </w:p>
+    <w:tbl>
+      <w:tblPr>
+        <w:tblW w:w="9300" w:type="dxa"/>
+        <w:tblBorders>
+          <w:top w:val="dashed" w:sz="10" w:space="0" w:color="9CA3AF"/>
+          <w:left w:val="dashed" w:sz="10" w:space="0" w:color="9CA3AF"/>
+          <w:bottom w:val="dashed" w:sz="10" w:space="0" w:color="9CA3AF"/>
+          <w:right w:val="dashed" w:sz="10" w:space="0" w:color="9CA3AF"/>
+          <w:insideH w:val="dashed" w:sz="10" w:space="0" w:color="9CA3AF"/>
+          <w:insideV w:val="dashed" w:sz="10" w:space="0" w:color="9CA3AF"/>
+        </w:tblBorders>
+        <w:tblCellMar>
+          <w:top w:w="80" w:type="dxa"/>
+          <w:bottom w:w="80" w:type="dxa"/>
+        </w:tblCellMar>
+      </w:tblPr>
+      <w:tblGrid>
+        <w:gridCol w:w="9300"/>
+      </w:tblGrid>
+      <w:tr>
+        <w:trPr>
+          <w:trHeight w:val="1500"/>
+        </w:trPr>
+        <w:tc>
+          <w:tcPr>
+            <w:tcW w:w="9300" w:type="dxa"/>
+            <w:vAlign w:val="center"/>
+          </w:tcPr>
+          <w:p>
+            <w:pPr>
+              <w:jc w:val="center"/>
+              <w:spacing w:after="0"/>
+            </w:pPr>
+            <w:r>
+              <w:rPr>
+                <w:color w:val="9CA3AF"/>
+                <w:sz w:val="22"/>
+              </w:rPr>
+              <w:t xml:space="preserve">📷 Hình 3 — đã chọn NHẬP</w:t>
+            </w:r>
+          </w:p>
+        </w:tc>
+      </w:tr>
+    </w:tbl>
+    <w:p>
+      <w:pPr>
+        <w:spacing w:after="160"/>
+      </w:pPr>
+    </w:p>
+    <w:p>
+      <w:pPr>
+        <w:spacing w:after="60" w:line="276" w:lineRule="auto"/>
+      </w:pPr>
+      <w:r>
+        <w:rPr>
+          <w:b/>
+          <w:color w:val="1B4D3E"/>
+          <w:sz w:val="26"/>
+          <w:szCs w:val="26"/>
+        </w:rPr>
+        <w:t xml:space="preserve">Bước 2.  </w:t>
+      </w:r>
+      <w:r>
+        <w:rPr>
+          <w:b/>
+          <w:sz w:val="26"/>
+          <w:szCs w:val="26"/>
+        </w:rPr>
+        <w:t xml:space="preserve">Chọn nguồn mủ</w:t>
       </w:r>
     </w:p>
     <w:p>
@@ -190,7 +495,7 @@
           <w:sz w:val="22"/>
           <w:szCs w:val="22"/>
         </w:rPr>
-        <w:t xml:space="preserve">Bấm nút tạo phiếu mới → chọn loại: Cân nhập.</w:t>
+        <w:t xml:space="preserve">1 trong: Deal đã chốt / Đại lý trực tiếp / Nhà cung cấp.</w:t>
       </w:r>
     </w:p>
     <w:tbl>
@@ -231,7 +536,7 @@
                 <w:color w:val="9CA3AF"/>
                 <w:sz w:val="22"/>
               </w:rPr>
-              <w:t xml:space="preserve">📷 Hình 2 — Nút tạo phiếu + chọn Cân nhập</w:t>
+              <w:t xml:space="preserve">📷 Hình 4 — Màn hình chọn nguồn mủ</w:t>
             </w:r>
           </w:p>
         </w:tc>
@@ -253,7 +558,7 @@
           <w:sz w:val="26"/>
           <w:szCs w:val="26"/>
         </w:rPr>
-        <w:t xml:space="preserve">Bước 2.  </w:t>
+        <w:t xml:space="preserve">Bước 3.  </w:t>
       </w:r>
       <w:r>
         <w:rPr>
@@ -261,7 +566,7 @@
           <w:sz w:val="26"/>
           <w:szCs w:val="26"/>
         </w:rPr>
-        <w:t xml:space="preserve">Chọn nguồn mủ</w:t>
+        <w:t xml:space="preserve">Chọn loại mủ</w:t>
       </w:r>
     </w:p>
     <w:p>
@@ -282,7 +587,7 @@
           <w:sz w:val="22"/>
           <w:szCs w:val="22"/>
         </w:rPr>
-        <w:t xml:space="preserve">Chọn 1 trong: theo Deal đã chốt / Đại lý trực tiếp / Nhà cung cấp.</w:t>
+        <w:t xml:space="preserve">💧 Mủ nước · 🪨 Mủ tạp · 🥣 Mủ chén · 📄 Mủ tờ · 🟫 Mủ RSS3.</w:t>
       </w:r>
     </w:p>
     <w:tbl>
@@ -323,7 +628,7 @@
                 <w:color w:val="9CA3AF"/>
                 <w:sz w:val="22"/>
               </w:rPr>
-              <w:t xml:space="preserve">📷 Hình 3 — Màn hình chọn nguồn mủ</w:t>
+              <w:t xml:space="preserve">📷 Hình 5 — Thanh chọn loại mủ</w:t>
             </w:r>
           </w:p>
         </w:tc>
@@ -345,7 +650,7 @@
           <w:sz w:val="26"/>
           <w:szCs w:val="26"/>
         </w:rPr>
-        <w:t xml:space="preserve">Bước 3.  </w:t>
+        <w:t xml:space="preserve">Bước 4.  </w:t>
       </w:r>
       <w:r>
         <w:rPr>
@@ -353,49 +658,7 @@
           <w:sz w:val="26"/>
           <w:szCs w:val="26"/>
         </w:rPr>
-        <w:t xml:space="preserve">Chọn loại mủ</w:t>
-      </w:r>
-    </w:p>
-    <w:p>
-      <w:pPr>
-        <w:ind w:left="240"/>
-        <w:spacing w:after="80" w:line="276" w:lineRule="auto"/>
-      </w:pPr>
-      <w:r>
-        <w:rPr>
-          <w:b/>
-          <w:sz w:val="22"/>
-          <w:szCs w:val="22"/>
-        </w:rPr>
-        <w:t xml:space="preserve">• </w:t>
-      </w:r>
-      <w:r>
-        <w:rPr>
-          <w:sz w:val="22"/>
-          <w:szCs w:val="22"/>
-        </w:rPr>
-        <w:t xml:space="preserve">Bấm 1 chạm: 💧 Mủ nước · 🪨 Mủ tạp · 🥣 Mủ chén · 📄 Mủ tờ · 🟫 Mủ RSS3.</w:t>
-      </w:r>
-    </w:p>
-    <w:p>
-      <w:pPr>
-        <w:ind w:left="240"/>
-        <w:spacing w:after="80" w:line="276" w:lineRule="auto"/>
-      </w:pPr>
-      <w:r>
-        <w:rPr>
-          <w:b/>
-          <w:sz w:val="22"/>
-          <w:szCs w:val="22"/>
-        </w:rPr>
-        <w:t xml:space="preserve">• </w:t>
-      </w:r>
-      <w:r>
-        <w:rPr>
-          <w:sz w:val="22"/>
-          <w:szCs w:val="22"/>
-        </w:rPr>
-        <w:t xml:space="preserve">Mủ nước tính theo DRC (giá khô); các loại còn lại tính theo cân thực tế.</w:t>
+        <w:t xml:space="preserve">Nhập biển số xe + tài xế</w:t>
       </w:r>
     </w:p>
     <w:tbl>
@@ -436,7 +699,7 @@
                 <w:color w:val="9CA3AF"/>
                 <w:sz w:val="22"/>
               </w:rPr>
-              <w:t xml:space="preserve">📷 Hình 4 — Thanh chọn loại mủ (các nút)</w:t>
+              <w:t xml:space="preserve">📷 Hình 6 — Ô nhập biển số xe + tài xế</w:t>
             </w:r>
           </w:p>
         </w:tc>
@@ -458,7 +721,7 @@
           <w:sz w:val="26"/>
           <w:szCs w:val="26"/>
         </w:rPr>
-        <w:t xml:space="preserve">Bước 4.  </w:t>
+        <w:t xml:space="preserve">Bước 5.  </w:t>
       </w:r>
       <w:r>
         <w:rPr>
@@ -466,7 +729,7 @@
           <w:sz w:val="26"/>
           <w:szCs w:val="26"/>
         </w:rPr>
-        <w:t xml:space="preserve">Nhập thông tin xe</w:t>
+        <w:t xml:space="preserve">Cân lần 1 — Gross (xe + hàng) + chụp 3 ảnh</w:t>
       </w:r>
     </w:p>
     <w:p>
@@ -487,7 +750,99 @@
           <w:sz w:val="22"/>
           <w:szCs w:val="22"/>
         </w:rPr>
-        <w:t xml:space="preserve">Nhập Biển số xe + Tên tài xế. App tự gợi ý biển số đã có.</w:t>
+        <w:t xml:space="preserve">Xe chở hàng lên cân → bấm Lấy số cân lần 1. Chụp đủ: Trước · Sau · Tài xế.</w:t>
+      </w:r>
+    </w:p>
+    <w:tbl>
+      <w:tblPr>
+        <w:tblW w:w="9300" w:type="dxa"/>
+        <w:tblBorders>
+          <w:top w:val="dashed" w:sz="10" w:space="0" w:color="9CA3AF"/>
+          <w:left w:val="dashed" w:sz="10" w:space="0" w:color="9CA3AF"/>
+          <w:bottom w:val="dashed" w:sz="10" w:space="0" w:color="9CA3AF"/>
+          <w:right w:val="dashed" w:sz="10" w:space="0" w:color="9CA3AF"/>
+          <w:insideH w:val="dashed" w:sz="10" w:space="0" w:color="9CA3AF"/>
+          <w:insideV w:val="dashed" w:sz="10" w:space="0" w:color="9CA3AF"/>
+        </w:tblBorders>
+        <w:tblCellMar>
+          <w:top w:w="80" w:type="dxa"/>
+          <w:bottom w:w="80" w:type="dxa"/>
+        </w:tblCellMar>
+      </w:tblPr>
+      <w:tblGrid>
+        <w:gridCol w:w="9300"/>
+      </w:tblGrid>
+      <w:tr>
+        <w:trPr>
+          <w:trHeight w:val="2800"/>
+        </w:trPr>
+        <w:tc>
+          <w:tcPr>
+            <w:tcW w:w="9300" w:type="dxa"/>
+            <w:vAlign w:val="center"/>
+          </w:tcPr>
+          <w:p>
+            <w:pPr>
+              <w:jc w:val="center"/>
+              <w:spacing w:after="0"/>
+            </w:pPr>
+            <w:r>
+              <w:rPr>
+                <w:color w:val="9CA3AF"/>
+                <w:sz w:val="22"/>
+              </w:rPr>
+              <w:t xml:space="preserve">📷 Hình 7 — Cân lần 1 + khu vực chụp 3 ảnh</w:t>
+            </w:r>
+          </w:p>
+        </w:tc>
+      </w:tr>
+    </w:tbl>
+    <w:p>
+      <w:pPr>
+        <w:spacing w:after="160"/>
+      </w:pPr>
+    </w:p>
+    <w:p>
+      <w:pPr>
+        <w:spacing w:after="60" w:line="276" w:lineRule="auto"/>
+      </w:pPr>
+      <w:r>
+        <w:rPr>
+          <w:b/>
+          <w:color w:val="1B4D3E"/>
+          <w:sz w:val="26"/>
+          <w:szCs w:val="26"/>
+        </w:rPr>
+        <w:t xml:space="preserve">Bước 6.  </w:t>
+      </w:r>
+      <w:r>
+        <w:rPr>
+          <w:b/>
+          <w:sz w:val="26"/>
+          <w:szCs w:val="26"/>
+        </w:rPr>
+        <w:t xml:space="preserve">Cân lần 2 — Tare (xe rỗng)</w:t>
+      </w:r>
+    </w:p>
+    <w:p>
+      <w:pPr>
+        <w:ind w:left="240"/>
+        <w:spacing w:after="80" w:line="276" w:lineRule="auto"/>
+      </w:pPr>
+      <w:r>
+        <w:rPr>
+          <w:b/>
+          <w:sz w:val="22"/>
+          <w:szCs w:val="22"/>
+        </w:rPr>
+        <w:t xml:space="preserve">• </w:t>
+      </w:r>
+      <w:r>
+        <w:rPr>
+          <w:sz w:val="22"/>
+          <w:szCs w:val="22"/>
+        </w:rPr>
+        <w:t xml:space="preserve">Đổ hàng xong, xe rỗng lên cân → bấm Lấy số cân lần 2. Net = Lần 1 − Lần 2.</w:t>
       </w:r>
     </w:p>
     <w:tbl>
@@ -528,7 +883,7 @@
                 <w:color w:val="9CA3AF"/>
                 <w:sz w:val="22"/>
               </w:rPr>
-              <w:t xml:space="preserve">📷 Hình 5 — Ô nhập biển số xe + tài xế</w:t>
+              <w:t xml:space="preserve">📷 Hình 8 — Cân lần 2 + kết quả Net</w:t>
             </w:r>
           </w:p>
         </w:tc>
@@ -550,7 +905,7 @@
           <w:sz w:val="26"/>
           <w:szCs w:val="26"/>
         </w:rPr>
-        <w:t xml:space="preserve">Bước 5.  </w:t>
+        <w:t xml:space="preserve">Bước 7.  </w:t>
       </w:r>
       <w:r>
         <w:rPr>
@@ -558,162 +913,7 @@
           <w:sz w:val="26"/>
           <w:szCs w:val="26"/>
         </w:rPr>
-        <w:t xml:space="preserve">Cân lần 1 — xe chở hàng (Gross) + chụp ảnh</w:t>
-      </w:r>
-    </w:p>
-    <w:p>
-      <w:pPr>
-        <w:ind w:left="240"/>
-        <w:spacing w:after="80" w:line="276" w:lineRule="auto"/>
-      </w:pPr>
-      <w:r>
-        <w:rPr>
-          <w:b/>
-          <w:sz w:val="22"/>
-          <w:szCs w:val="22"/>
-        </w:rPr>
-        <w:t xml:space="preserve">• </w:t>
-      </w:r>
-      <w:r>
-        <w:rPr>
-          <w:sz w:val="22"/>
-          <w:szCs w:val="22"/>
-        </w:rPr>
-        <w:t xml:space="preserve">Xe lên bàn cân → bấm Lấy số cân lần 1 (ghi khối lượng xe + hàng).</w:t>
-      </w:r>
-    </w:p>
-    <w:p>
-      <w:pPr>
-        <w:ind w:left="240"/>
-        <w:spacing w:after="80" w:line="276" w:lineRule="auto"/>
-      </w:pPr>
-      <w:r>
-        <w:rPr>
-          <w:b/>
-          <w:sz w:val="22"/>
-          <w:szCs w:val="22"/>
-        </w:rPr>
-        <w:t xml:space="preserve">• </w:t>
-      </w:r>
-      <w:r>
-        <w:rPr>
-          <w:sz w:val="22"/>
-          <w:szCs w:val="22"/>
-        </w:rPr>
-        <w:t xml:space="preserve">Chụp đủ 3 ảnh: Trước xe · Sau xe · Tài xế (theo nút chụp trên màn hình).</w:t>
-      </w:r>
-    </w:p>
-    <w:tbl>
-      <w:tblPr>
-        <w:tblW w:w="9300" w:type="dxa"/>
-        <w:tblBorders>
-          <w:top w:val="dashed" w:sz="10" w:space="0" w:color="9CA3AF"/>
-          <w:left w:val="dashed" w:sz="10" w:space="0" w:color="9CA3AF"/>
-          <w:bottom w:val="dashed" w:sz="10" w:space="0" w:color="9CA3AF"/>
-          <w:right w:val="dashed" w:sz="10" w:space="0" w:color="9CA3AF"/>
-          <w:insideH w:val="dashed" w:sz="10" w:space="0" w:color="9CA3AF"/>
-          <w:insideV w:val="dashed" w:sz="10" w:space="0" w:color="9CA3AF"/>
-        </w:tblBorders>
-        <w:tblCellMar>
-          <w:top w:w="80" w:type="dxa"/>
-          <w:bottom w:w="80" w:type="dxa"/>
-        </w:tblCellMar>
-      </w:tblPr>
-      <w:tblGrid>
-        <w:gridCol w:w="9300"/>
-      </w:tblGrid>
-      <w:tr>
-        <w:trPr>
-          <w:trHeight w:val="2800"/>
-        </w:trPr>
-        <w:tc>
-          <w:tcPr>
-            <w:tcW w:w="9300" w:type="dxa"/>
-            <w:vAlign w:val="center"/>
-          </w:tcPr>
-          <w:p>
-            <w:pPr>
-              <w:jc w:val="center"/>
-              <w:spacing w:after="0"/>
-            </w:pPr>
-            <w:r>
-              <w:rPr>
-                <w:color w:val="9CA3AF"/>
-                <w:sz w:val="22"/>
-              </w:rPr>
-              <w:t xml:space="preserve">📷 Hình 6 — Nút cân lần 1 + khu vực chụp 3 ảnh</w:t>
-            </w:r>
-          </w:p>
-        </w:tc>
-      </w:tr>
-    </w:tbl>
-    <w:p>
-      <w:pPr>
-        <w:spacing w:after="160"/>
-      </w:pPr>
-    </w:p>
-    <w:p>
-      <w:pPr>
-        <w:spacing w:after="60" w:line="276" w:lineRule="auto"/>
-      </w:pPr>
-      <w:r>
-        <w:rPr>
-          <w:b/>
-          <w:color w:val="1B4D3E"/>
-          <w:sz w:val="26"/>
-          <w:szCs w:val="26"/>
-        </w:rPr>
-        <w:t xml:space="preserve">Bước 6.  </w:t>
-      </w:r>
-      <w:r>
-        <w:rPr>
-          <w:b/>
-          <w:sz w:val="26"/>
-          <w:szCs w:val="26"/>
-        </w:rPr>
-        <w:t xml:space="preserve">Cân lần 2 — xe rỗng (Tare)</w:t>
-      </w:r>
-    </w:p>
-    <w:p>
-      <w:pPr>
-        <w:ind w:left="240"/>
-        <w:spacing w:after="80" w:line="276" w:lineRule="auto"/>
-      </w:pPr>
-      <w:r>
-        <w:rPr>
-          <w:b/>
-          <w:sz w:val="22"/>
-          <w:szCs w:val="22"/>
-        </w:rPr>
-        <w:t xml:space="preserve">• </w:t>
-      </w:r>
-      <w:r>
-        <w:rPr>
-          <w:sz w:val="22"/>
-          <w:szCs w:val="22"/>
-        </w:rPr>
-        <w:t xml:space="preserve">Sau khi đổ hàng, xe rỗng lên cân → bấm Lấy số cân lần 2.</w:t>
-      </w:r>
-    </w:p>
-    <w:p>
-      <w:pPr>
-        <w:ind w:left="240"/>
-        <w:spacing w:after="80" w:line="276" w:lineRule="auto"/>
-      </w:pPr>
-      <w:r>
-        <w:rPr>
-          <w:b/>
-          <w:sz w:val="22"/>
-          <w:szCs w:val="22"/>
-        </w:rPr>
-        <w:t xml:space="preserve">• </w:t>
-      </w:r>
-      <w:r>
-        <w:rPr>
-          <w:sz w:val="22"/>
-          <w:szCs w:val="22"/>
-        </w:rPr>
-        <w:t xml:space="preserve">Hệ thống tự tính: Khối lượng hàng (Net) = Cân lần 1 − Cân lần 2.</w:t>
+        <w:t xml:space="preserve">(Chỉ Mủ nước) Nhập DRC</w:t>
       </w:r>
     </w:p>
     <w:tbl>
@@ -754,7 +954,7 @@
                 <w:color w:val="9CA3AF"/>
                 <w:sz w:val="22"/>
               </w:rPr>
-              <w:t xml:space="preserve">📷 Hình 7 — Màn hình cân lần 2 + kết quả Net</w:t>
+              <w:t xml:space="preserve">📷 Hình 9 — Ô nhập DRC</w:t>
             </w:r>
           </w:p>
         </w:tc>
@@ -776,7 +976,7 @@
           <w:sz w:val="26"/>
           <w:szCs w:val="26"/>
         </w:rPr>
-        <w:t xml:space="preserve">Bước 7.  </w:t>
+        <w:t xml:space="preserve">Bước 8.  </w:t>
       </w:r>
       <w:r>
         <w:rPr>
@@ -784,7 +984,7 @@
           <w:sz w:val="26"/>
           <w:szCs w:val="26"/>
         </w:rPr>
-        <w:t xml:space="preserve">(Chỉ Mủ nước) Nhập DRC</w:t>
+        <w:t xml:space="preserve">Hoàn tất + In phiếu</w:t>
       </w:r>
     </w:p>
     <w:p>
@@ -805,7 +1005,112 @@
           <w:sz w:val="22"/>
           <w:szCs w:val="22"/>
         </w:rPr>
-        <w:t xml:space="preserve">Với mủ nước: nhập/tra DRC% để ra khối lượng khô + thành tiền.</w:t>
+        <w:t xml:space="preserve">Kiểm lại loại mủ / biển số / số cân / ảnh → Hoàn tất → In (giao tài xế 1 bản).</w:t>
+      </w:r>
+    </w:p>
+    <w:tbl>
+      <w:tblPr>
+        <w:tblW w:w="9300" w:type="dxa"/>
+        <w:tblBorders>
+          <w:top w:val="dashed" w:sz="10" w:space="0" w:color="9CA3AF"/>
+          <w:left w:val="dashed" w:sz="10" w:space="0" w:color="9CA3AF"/>
+          <w:bottom w:val="dashed" w:sz="10" w:space="0" w:color="9CA3AF"/>
+          <w:right w:val="dashed" w:sz="10" w:space="0" w:color="9CA3AF"/>
+          <w:insideH w:val="dashed" w:sz="10" w:space="0" w:color="9CA3AF"/>
+          <w:insideV w:val="dashed" w:sz="10" w:space="0" w:color="9CA3AF"/>
+        </w:tblBorders>
+        <w:tblCellMar>
+          <w:top w:w="80" w:type="dxa"/>
+          <w:bottom w:w="80" w:type="dxa"/>
+        </w:tblCellMar>
+      </w:tblPr>
+      <w:tblGrid>
+        <w:gridCol w:w="9300"/>
+      </w:tblGrid>
+      <w:tr>
+        <w:trPr>
+          <w:trHeight w:val="3000"/>
+        </w:trPr>
+        <w:tc>
+          <w:tcPr>
+            <w:tcW w:w="9300" w:type="dxa"/>
+            <w:vAlign w:val="center"/>
+          </w:tcPr>
+          <w:p>
+            <w:pPr>
+              <w:jc w:val="center"/>
+              <w:spacing w:after="0"/>
+            </w:pPr>
+            <w:r>
+              <w:rPr>
+                <w:color w:val="9CA3AF"/>
+                <w:sz w:val="22"/>
+              </w:rPr>
+              <w:t xml:space="preserve">📷 Hình 10 — Phiếu cân in ra (mẫu)</w:t>
+            </w:r>
+          </w:p>
+        </w:tc>
+      </w:tr>
+    </w:tbl>
+    <w:p>
+      <w:pPr>
+        <w:spacing w:after="160"/>
+      </w:pPr>
+    </w:p>
+    <w:p>
+      <w:pPr>
+        <w:spacing w:after="100" w:line="276" w:lineRule="auto"/>
+      </w:pPr>
+      <w:r>
+        <w:rPr>
+          <w:b/>
+          <w:color w:val="1B4D3E"/>
+          <w:sz w:val="28"/>
+          <w:szCs w:val="28"/>
+        </w:rPr>
+        <w:t xml:space="preserve">B. Cân XUẤT đi cảng (tóm tắt)</w:t>
+      </w:r>
+    </w:p>
+    <w:p>
+      <w:pPr>
+        <w:ind w:left="240"/>
+        <w:spacing w:after="80" w:line="276" w:lineRule="auto"/>
+      </w:pPr>
+      <w:r>
+        <w:rPr>
+          <w:b/>
+          <w:sz w:val="22"/>
+          <w:szCs w:val="22"/>
+        </w:rPr>
+        <w:t xml:space="preserve">• </w:t>
+      </w:r>
+      <w:r>
+        <w:rPr>
+          <w:sz w:val="22"/>
+          <w:szCs w:val="22"/>
+        </w:rPr>
+        <w:t xml:space="preserve">Chọn XUẤT → chọn Lệnh điều động (Mã · Xe · Tài xế) → app tự điền xe/tài xế.</w:t>
+      </w:r>
+    </w:p>
+    <w:p>
+      <w:pPr>
+        <w:ind w:left="240"/>
+        <w:spacing w:after="80" w:line="276" w:lineRule="auto"/>
+      </w:pPr>
+      <w:r>
+        <w:rPr>
+          <w:b/>
+          <w:sz w:val="22"/>
+          <w:szCs w:val="22"/>
+        </w:rPr>
+        <w:t xml:space="preserve">• </w:t>
+      </w:r>
+      <w:r>
+        <w:rPr>
+          <w:sz w:val="22"/>
+          <w:szCs w:val="22"/>
+        </w:rPr>
+        <w:t xml:space="preserve">Cân Tare (xe rỗng) → Gross (xe + hàng) → xác nhận "Đã cân". Số cân đồng bộ về Lệnh + Đơn hàng.</w:t>
       </w:r>
     </w:p>
     <w:tbl>
@@ -846,7 +1151,7 @@
                 <w:color w:val="9CA3AF"/>
                 <w:sz w:val="22"/>
               </w:rPr>
-              <w:t xml:space="preserve">📷 Hình 8 — Ô nhập DRC (chỉ hiện với mủ nước)</w:t>
+              <w:t xml:space="preserve">📷 Hình 11 — Cân xuất + chọn Lệnh điều động</w:t>
             </w:r>
           </w:p>
         </w:tc>
@@ -859,24 +1164,16 @@
     </w:p>
     <w:p>
       <w:pPr>
-        <w:spacing w:after="60" w:line="276" w:lineRule="auto"/>
+        <w:spacing w:after="100" w:line="276" w:lineRule="auto"/>
       </w:pPr>
       <w:r>
         <w:rPr>
           <w:b/>
           <w:color w:val="1B4D3E"/>
-          <w:sz w:val="26"/>
-          <w:szCs w:val="26"/>
-        </w:rPr>
-        <w:t xml:space="preserve">Bước 8.  </w:t>
-      </w:r>
-      <w:r>
-        <w:rPr>
-          <w:b/>
-          <w:sz w:val="26"/>
-          <w:szCs w:val="26"/>
-        </w:rPr>
-        <w:t xml:space="preserve">Xác nhận / Hoàn tất phiếu</w:t>
+          <w:sz w:val="28"/>
+          <w:szCs w:val="28"/>
+        </w:rPr>
+        <w:t xml:space="preserve">C. Cân CỔNG nội bộ (tóm tắt)</w:t>
       </w:r>
     </w:p>
     <w:p>
@@ -897,7 +1194,7 @@
           <w:sz w:val="22"/>
           <w:szCs w:val="22"/>
         </w:rPr>
-        <w:t xml:space="preserve">Kiểm lại loại mủ, biển số, số cân, ảnh → bấm Hoàn tất.</w:t>
+        <w:t xml:space="preserve">Chọn CỔNG → cân vào → cân ra → chênh lệch = hàng. Không gắn đơn / nguồn mủ.</w:t>
       </w:r>
     </w:p>
     <w:tbl>
@@ -938,7 +1235,7 @@
                 <w:color w:val="9CA3AF"/>
                 <w:sz w:val="22"/>
               </w:rPr>
-              <w:t xml:space="preserve">📷 Hình 9 — Nút xác nhận/hoàn tất phiếu</w:t>
+              <w:t xml:space="preserve">📷 Hình 12 — Cân cổng nội bộ</w:t>
             </w:r>
           </w:p>
         </w:tc>
@@ -951,98 +1248,6 @@
     </w:p>
     <w:p>
       <w:pPr>
-        <w:spacing w:after="60" w:line="276" w:lineRule="auto"/>
-      </w:pPr>
-      <w:r>
-        <w:rPr>
-          <w:b/>
-          <w:color w:val="1B4D3E"/>
-          <w:sz w:val="26"/>
-          <w:szCs w:val="26"/>
-        </w:rPr>
-        <w:t xml:space="preserve">Bước 9.  </w:t>
-      </w:r>
-      <w:r>
-        <w:rPr>
-          <w:b/>
-          <w:sz w:val="26"/>
-          <w:szCs w:val="26"/>
-        </w:rPr>
-        <w:t xml:space="preserve">In phiếu cân</w:t>
-      </w:r>
-    </w:p>
-    <w:p>
-      <w:pPr>
-        <w:ind w:left="240"/>
-        <w:spacing w:after="80" w:line="276" w:lineRule="auto"/>
-      </w:pPr>
-      <w:r>
-        <w:rPr>
-          <w:b/>
-          <w:sz w:val="22"/>
-          <w:szCs w:val="22"/>
-        </w:rPr>
-        <w:t xml:space="preserve">• </w:t>
-      </w:r>
-      <w:r>
-        <w:rPr>
-          <w:sz w:val="22"/>
-          <w:szCs w:val="22"/>
-        </w:rPr>
-        <w:t xml:space="preserve">Bấm In → ra phiếu cân (có QR Cổng Đại lý). Giao 1 bản cho tài xế.</w:t>
-      </w:r>
-    </w:p>
-    <w:tbl>
-      <w:tblPr>
-        <w:tblW w:w="9300" w:type="dxa"/>
-        <w:tblBorders>
-          <w:top w:val="dashed" w:sz="10" w:space="0" w:color="9CA3AF"/>
-          <w:left w:val="dashed" w:sz="10" w:space="0" w:color="9CA3AF"/>
-          <w:bottom w:val="dashed" w:sz="10" w:space="0" w:color="9CA3AF"/>
-          <w:right w:val="dashed" w:sz="10" w:space="0" w:color="9CA3AF"/>
-          <w:insideH w:val="dashed" w:sz="10" w:space="0" w:color="9CA3AF"/>
-          <w:insideV w:val="dashed" w:sz="10" w:space="0" w:color="9CA3AF"/>
-        </w:tblBorders>
-        <w:tblCellMar>
-          <w:top w:w="80" w:type="dxa"/>
-          <w:bottom w:w="80" w:type="dxa"/>
-        </w:tblCellMar>
-      </w:tblPr>
-      <w:tblGrid>
-        <w:gridCol w:w="9300"/>
-      </w:tblGrid>
-      <w:tr>
-        <w:trPr>
-          <w:trHeight w:val="3200"/>
-        </w:trPr>
-        <w:tc>
-          <w:tcPr>
-            <w:tcW w:w="9300" w:type="dxa"/>
-            <w:vAlign w:val="center"/>
-          </w:tcPr>
-          <w:p>
-            <w:pPr>
-              <w:jc w:val="center"/>
-              <w:spacing w:after="0"/>
-            </w:pPr>
-            <w:r>
-              <w:rPr>
-                <w:color w:val="9CA3AF"/>
-                <w:sz w:val="22"/>
-              </w:rPr>
-              <w:t xml:space="preserve">📷 Hình 10 — Phiếu cân in ra (mẫu)</w:t>
-            </w:r>
-          </w:p>
-        </w:tc>
-      </w:tr>
-    </w:tbl>
-    <w:p>
-      <w:pPr>
-        <w:spacing w:after="160"/>
-      </w:pPr>
-    </w:p>
-    <w:p>
-      <w:pPr>
         <w:spacing w:after="100" w:line="276" w:lineRule="auto"/>
       </w:pPr>
       <w:r>
@@ -1052,7 +1257,7 @@
           <w:sz w:val="28"/>
           <w:szCs w:val="28"/>
         </w:rPr>
-        <w:t xml:space="preserve">B. Cân XUẤT hàng (xe chở hàng đi cảng)</w:t>
+        <w:t xml:space="preserve">Lưu ý chung</w:t>
       </w:r>
     </w:p>
     <w:p>
@@ -1073,7 +1278,7 @@
           <w:sz w:val="22"/>
           <w:szCs w:val="22"/>
         </w:rPr>
-        <w:t xml:space="preserve">Chọn Cân xuất → chọn Lệnh điều động (Mã · Xe · Tài xế) → app tự điền xe/tài xế.</w:t>
+        <w:t xml:space="preserve">Chọn đúng loại mủ ngay từ đầu — tạo phiếu rồi KHÔNG sửa loại mủ trên app được (báo IT).</w:t>
       </w:r>
     </w:p>
     <w:p>
@@ -1094,133 +1299,7 @@
           <w:sz w:val="22"/>
           <w:szCs w:val="22"/>
         </w:rPr>
-        <w:t xml:space="preserve">Cân tổng cả xe 1 lần → xác nhận "Đã cân". Số cân đồng bộ về Lệnh điều động + Đơn hàng.</w:t>
-      </w:r>
-    </w:p>
-    <w:tbl>
-      <w:tblPr>
-        <w:tblW w:w="9300" w:type="dxa"/>
-        <w:tblBorders>
-          <w:top w:val="dashed" w:sz="10" w:space="0" w:color="9CA3AF"/>
-          <w:left w:val="dashed" w:sz="10" w:space="0" w:color="9CA3AF"/>
-          <w:bottom w:val="dashed" w:sz="10" w:space="0" w:color="9CA3AF"/>
-          <w:right w:val="dashed" w:sz="10" w:space="0" w:color="9CA3AF"/>
-          <w:insideH w:val="dashed" w:sz="10" w:space="0" w:color="9CA3AF"/>
-          <w:insideV w:val="dashed" w:sz="10" w:space="0" w:color="9CA3AF"/>
-        </w:tblBorders>
-        <w:tblCellMar>
-          <w:top w:w="80" w:type="dxa"/>
-          <w:bottom w:w="80" w:type="dxa"/>
-        </w:tblCellMar>
-      </w:tblPr>
-      <w:tblGrid>
-        <w:gridCol w:w="9300"/>
-      </w:tblGrid>
-      <w:tr>
-        <w:trPr>
-          <w:trHeight w:val="2400"/>
-        </w:trPr>
-        <w:tc>
-          <w:tcPr>
-            <w:tcW w:w="9300" w:type="dxa"/>
-            <w:vAlign w:val="center"/>
-          </w:tcPr>
-          <w:p>
-            <w:pPr>
-              <w:jc w:val="center"/>
-              <w:spacing w:after="0"/>
-            </w:pPr>
-            <w:r>
-              <w:rPr>
-                <w:color w:val="9CA3AF"/>
-                <w:sz w:val="22"/>
-              </w:rPr>
-              <w:t xml:space="preserve">📷 Hình 11 — Màn hình cân xuất + chọn Lệnh điều động</w:t>
-            </w:r>
-          </w:p>
-        </w:tc>
-      </w:tr>
-    </w:tbl>
-    <w:p>
-      <w:pPr>
-        <w:spacing w:after="160"/>
-      </w:pPr>
-    </w:p>
-    <w:p>
-      <w:pPr>
-        <w:spacing w:after="100" w:line="276" w:lineRule="auto"/>
-      </w:pPr>
-      <w:r>
-        <w:rPr>
-          <w:b/>
-          <w:color w:val="1B4D3E"/>
-          <w:sz w:val="28"/>
-          <w:szCs w:val="28"/>
-        </w:rPr>
-        <w:t xml:space="preserve">Lưu ý chung</w:t>
-      </w:r>
-    </w:p>
-    <w:p>
-      <w:pPr>
-        <w:ind w:left="240"/>
-        <w:spacing w:after="80" w:line="276" w:lineRule="auto"/>
-      </w:pPr>
-      <w:r>
-        <w:rPr>
-          <w:b/>
-          <w:sz w:val="22"/>
-          <w:szCs w:val="22"/>
-        </w:rPr>
-        <w:t xml:space="preserve">• </w:t>
-      </w:r>
-      <w:r>
-        <w:rPr>
-          <w:sz w:val="22"/>
-          <w:szCs w:val="22"/>
-        </w:rPr>
-        <w:t xml:space="preserve">Chọn đúng loại mủ ngay từ đầu — sau khi tạo phiếu KHÔNG sửa loại mủ trên app được (phải báo IT).</w:t>
-      </w:r>
-    </w:p>
-    <w:p>
-      <w:pPr>
-        <w:ind w:left="240"/>
-        <w:spacing w:after="80" w:line="276" w:lineRule="auto"/>
-      </w:pPr>
-      <w:r>
-        <w:rPr>
-          <w:b/>
-          <w:sz w:val="22"/>
-          <w:szCs w:val="22"/>
-        </w:rPr>
-        <w:t xml:space="preserve">• </w:t>
-      </w:r>
-      <w:r>
-        <w:rPr>
-          <w:sz w:val="22"/>
-          <w:szCs w:val="22"/>
-        </w:rPr>
-        <w:t xml:space="preserve">Chụp ảnh rõ biển số. Phiếu đang cân dở nằm ở mục "Phiếu đang cân dở", bấm "Tiếp tục" để cân tiếp.</w:t>
-      </w:r>
-    </w:p>
-    <w:p>
-      <w:pPr>
-        <w:ind w:left="240"/>
-        <w:spacing w:after="80" w:line="276" w:lineRule="auto"/>
-      </w:pPr>
-      <w:r>
-        <w:rPr>
-          <w:b/>
-          <w:sz w:val="22"/>
-          <w:szCs w:val="22"/>
-        </w:rPr>
-        <w:t xml:space="preserve">• </w:t>
-      </w:r>
-      <w:r>
-        <w:rPr>
-          <w:sz w:val="22"/>
-          <w:szCs w:val="22"/>
-        </w:rPr>
-        <w:t xml:space="preserve">Cân xuất: "Đã cân là được" — số cân gồm cả pallet/bao bì, không so với kế hoạch.</w:t>
+        <w:t xml:space="preserve">Phiếu cân dở nằm ở mục "Phiếu đang cân dở" → bấm "Tiếp tục" để cân lần 2.</w:t>
       </w:r>
     </w:p>
     <w:p>

</xml_diff>

<commit_message>
docs(weighbridge): embed real screenshots into Phong Điền weigh guide
Rebuilds huong-dan-can-phong-dien.docx with the 10 provided screenshots
embedded inline (sized to A4 width): home, ticket-type, source, rubber-type,
vehicle, note, create button, completed ticket (Net + IN PHIẾU), and the XUẤT
dispatch-order screen. Clarifies NHẬP/XUẤT cover both raw rubber and finished
goods, CỔNG is internal. Three boxes stay dashed (weigh-1, DRC, gate — no
screenshot yet). build_guide embeds PNGs via pizzip (media + rels + CT).

Co-Authored-By: Claude Opus 4.8 <noreply@anthropic.com>
</commit_message>
<xml_diff>
--- a/public/huong-dan-can-phong-dien.docx
+++ b/public/huong-dan-can-phong-dien.docx
@@ -48,7 +48,7 @@
     <w:p>
       <w:pPr>
         <w:ind w:left="240"/>
-        <w:spacing w:after="80" w:line="276" w:lineRule="auto"/>
+        <w:spacing w:after="70" w:line="276" w:lineRule="auto"/>
       </w:pPr>
       <w:r>
         <w:rPr>
@@ -63,13 +63,13 @@
           <w:sz w:val="22"/>
           <w:szCs w:val="22"/>
         </w:rPr>
-        <w:t xml:space="preserve">Mở App Cân trên máy tính của trạm cân (đã đăng nhập tài khoản nhân viên trạm).</w:t>
+        <w:t xml:space="preserve">Mở App Cân trên máy tính trạm cân (đã đăng nhập). Mỗi xe = 1 phiếu cân.</w:t>
       </w:r>
     </w:p>
     <w:p>
       <w:pPr>
         <w:ind w:left="240"/>
-        <w:spacing w:after="80" w:line="276" w:lineRule="auto"/>
+        <w:spacing w:after="70" w:line="276" w:lineRule="auto"/>
       </w:pPr>
       <w:r>
         <w:rPr>
@@ -84,7 +84,887 @@
           <w:sz w:val="22"/>
           <w:szCs w:val="22"/>
         </w:rPr>
-        <w:t xml:space="preserve">Mỗi xe = 1 phiếu cân. Chọn ĐÚNG loại phiếu ngay từ đầu (xem 3 loại dưới).</w:t>
+        <w:t xml:space="preserve">Ở màn hình chính: bấm "Tạo phiếu cân mới" để bắt đầu. Phiếu đang cân dở nằm bên dưới (bấm "Tiếp tục" để cân tiếp).</w:t>
+      </w:r>
+    </w:p>
+    <w:p>
+      <w:pPr>
+        <w:jc w:val="center"/>
+        <w:spacing w:after="60"/>
+      </w:pPr>
+      <w:r>
+        <w:drawing>
+          <wp:inline xmlns:wp="http://schemas.openxmlformats.org/drawingml/2006/wordprocessingDrawing" distT="0" distB="0" distL="0" distR="0">
+            <wp:extent cx="5850000" cy="3769511"/>
+            <wp:effectExtent l="0" t="0" r="0" b="0"/>
+            <wp:docPr id="100" name="Picture 100"/>
+            <wp:cNvGraphicFramePr>
+              <a:graphicFrameLocks xmlns:a="http://schemas.openxmlformats.org/drawingml/2006/main" noChangeAspect="1"/>
+            </wp:cNvGraphicFramePr>
+            <a:graphic xmlns:a="http://schemas.openxmlformats.org/drawingml/2006/main">
+              <a:graphicData uri="http://schemas.openxmlformats.org/drawingml/2006/picture">
+                <pic:pic xmlns:pic="http://schemas.openxmlformats.org/drawingml/2006/picture">
+                  <pic:nvPicPr>
+                    <pic:cNvPr id="100" name="img100"/>
+                    <pic:cNvPicPr/>
+                  </pic:nvPicPr>
+                  <pic:blipFill>
+                    <a:blip r:embed="rIdImg900"/>
+                    <a:stretch>
+                      <a:fillRect/>
+                    </a:stretch>
+                  </pic:blipFill>
+                  <pic:spPr>
+                    <a:xfrm>
+                      <a:off x="0" y="0"/>
+                      <a:ext cx="5850000" cy="3769511"/>
+                    </a:xfrm>
+                    <a:prstGeom prst="rect">
+                      <a:avLst/>
+                    </a:prstGeom>
+                  </pic:spPr>
+                </pic:pic>
+              </a:graphicData>
+            </a:graphic>
+          </wp:inline>
+        </w:drawing>
+      </w:r>
+    </w:p>
+    <w:p>
+      <w:pPr>
+        <w:jc w:val="center"/>
+        <w:spacing w:after="200" w:line="276" w:lineRule="auto"/>
+      </w:pPr>
+      <w:r>
+        <w:rPr>
+          <w:i/>
+          <w:color w:val="9CA3AF"/>
+          <w:sz w:val="18"/>
+          <w:szCs w:val="18"/>
+        </w:rPr>
+        <w:t xml:space="preserve">Màn hình chính App Cân — nút "Tạo phiếu cân mới"</w:t>
+      </w:r>
+    </w:p>
+    <w:p>
+      <w:pPr>
+        <w:spacing w:after="100" w:line="276" w:lineRule="auto"/>
+      </w:pPr>
+      <w:r>
+        <w:rPr>
+          <w:b/>
+          <w:color w:val="1B4D3E"/>
+          <w:sz w:val="28"/>
+          <w:szCs w:val="28"/>
+        </w:rPr>
+        <w:t xml:space="preserve">3 loại phiếu cân — chọn đúng ngay từ đầu</w:t>
+      </w:r>
+    </w:p>
+    <w:p>
+      <w:pPr>
+        <w:jc w:val="center"/>
+        <w:spacing w:after="60"/>
+      </w:pPr>
+      <w:r>
+        <w:drawing>
+          <wp:inline xmlns:wp="http://schemas.openxmlformats.org/drawingml/2006/wordprocessingDrawing" distT="0" distB="0" distL="0" distR="0">
+            <wp:extent cx="5850000" cy="872437"/>
+            <wp:effectExtent l="0" t="0" r="0" b="0"/>
+            <wp:docPr id="101" name="Picture 101"/>
+            <wp:cNvGraphicFramePr>
+              <a:graphicFrameLocks xmlns:a="http://schemas.openxmlformats.org/drawingml/2006/main" noChangeAspect="1"/>
+            </wp:cNvGraphicFramePr>
+            <a:graphic xmlns:a="http://schemas.openxmlformats.org/drawingml/2006/main">
+              <a:graphicData uri="http://schemas.openxmlformats.org/drawingml/2006/picture">
+                <pic:pic xmlns:pic="http://schemas.openxmlformats.org/drawingml/2006/picture">
+                  <pic:nvPicPr>
+                    <pic:cNvPr id="101" name="img101"/>
+                    <pic:cNvPicPr/>
+                  </pic:nvPicPr>
+                  <pic:blipFill>
+                    <a:blip r:embed="rIdImg901"/>
+                    <a:stretch>
+                      <a:fillRect/>
+                    </a:stretch>
+                  </pic:blipFill>
+                  <pic:spPr>
+                    <a:xfrm>
+                      <a:off x="0" y="0"/>
+                      <a:ext cx="5850000" cy="872437"/>
+                    </a:xfrm>
+                    <a:prstGeom prst="rect">
+                      <a:avLst/>
+                    </a:prstGeom>
+                  </pic:spPr>
+                </pic:pic>
+              </a:graphicData>
+            </a:graphic>
+          </wp:inline>
+        </w:drawing>
+      </w:r>
+    </w:p>
+    <w:p>
+      <w:pPr>
+        <w:jc w:val="center"/>
+        <w:spacing w:after="200" w:line="276" w:lineRule="auto"/>
+      </w:pPr>
+      <w:r>
+        <w:rPr>
+          <w:i/>
+          <w:color w:val="9CA3AF"/>
+          <w:sz w:val="18"/>
+          <w:szCs w:val="18"/>
+        </w:rPr>
+        <w:t xml:space="preserve">Thanh chọn loại phiếu: NHẬP · XUẤT · CỔNG</w:t>
+      </w:r>
+    </w:p>
+    <w:p>
+      <w:pPr>
+        <w:ind w:left="120"/>
+        <w:spacing w:after="30" w:line="276" w:lineRule="auto"/>
+      </w:pPr>
+      <w:r>
+        <w:rPr>
+          <w:b/>
+          <w:color w:val="1B4D3E"/>
+          <w:sz w:val="24"/>
+          <w:szCs w:val="24"/>
+        </w:rPr>
+        <w:t xml:space="preserve">① NHẬP (vào kho) — nhập MỦ và THÀNH PHẨM vào kho</w:t>
+      </w:r>
+    </w:p>
+    <w:p>
+      <w:pPr>
+        <w:ind w:left="240"/>
+        <w:spacing w:after="70" w:line="276" w:lineRule="auto"/>
+      </w:pPr>
+      <w:r>
+        <w:rPr>
+          <w:b/>
+          <w:sz w:val="22"/>
+          <w:szCs w:val="22"/>
+        </w:rPr>
+        <w:t xml:space="preserve">• </w:t>
+      </w:r>
+      <w:r>
+        <w:rPr>
+          <w:sz w:val="22"/>
+          <w:szCs w:val="22"/>
+        </w:rPr>
+        <w:t xml:space="preserve">Nhập mủ nguyên liệu (từ NCC/đại lý) HOẶC thành phẩm (RSS3, SVR…) vào kho.</w:t>
+      </w:r>
+    </w:p>
+    <w:p>
+      <w:pPr>
+        <w:ind w:left="240"/>
+        <w:spacing w:after="70" w:line="276" w:lineRule="auto"/>
+      </w:pPr>
+      <w:r>
+        <w:rPr>
+          <w:b/>
+          <w:sz w:val="22"/>
+          <w:szCs w:val="22"/>
+        </w:rPr>
+        <w:t xml:space="preserve">• </w:t>
+      </w:r>
+      <w:r>
+        <w:rPr>
+          <w:sz w:val="22"/>
+          <w:szCs w:val="22"/>
+        </w:rPr>
+        <w:t xml:space="preserve">Cân 2 lần: Gross (xe + hàng) vào  →  Tare (xe rỗng) ra  →  Net = Gross − Tare.</w:t>
+      </w:r>
+    </w:p>
+    <w:p>
+      <w:pPr>
+        <w:ind w:left="120"/>
+        <w:spacing w:after="30" w:line="276" w:lineRule="auto"/>
+      </w:pPr>
+      <w:r>
+        <w:rPr>
+          <w:b/>
+          <w:color w:val="1B4D3E"/>
+          <w:sz w:val="24"/>
+          <w:szCs w:val="24"/>
+        </w:rPr>
+        <w:t xml:space="preserve">② XUẤT (ra kho) — xuất MỦ và THÀNH PHẨM ra khỏi kho</w:t>
+      </w:r>
+    </w:p>
+    <w:p>
+      <w:pPr>
+        <w:ind w:left="240"/>
+        <w:spacing w:after="70" w:line="276" w:lineRule="auto"/>
+      </w:pPr>
+      <w:r>
+        <w:rPr>
+          <w:b/>
+          <w:sz w:val="22"/>
+          <w:szCs w:val="22"/>
+        </w:rPr>
+        <w:t xml:space="preserve">• </w:t>
+      </w:r>
+      <w:r>
+        <w:rPr>
+          <w:sz w:val="22"/>
+          <w:szCs w:val="22"/>
+        </w:rPr>
+        <w:t xml:space="preserve">Xuất hàng đi cảng / khách. Cân 2 lần NGƯỢC: Tare (xe rỗng) vào  →  Gross (xe + hàng) ra  →  Net.</w:t>
+      </w:r>
+    </w:p>
+    <w:p>
+      <w:pPr>
+        <w:ind w:left="240"/>
+        <w:spacing w:after="70" w:line="276" w:lineRule="auto"/>
+      </w:pPr>
+      <w:r>
+        <w:rPr>
+          <w:b/>
+          <w:sz w:val="22"/>
+          <w:szCs w:val="22"/>
+        </w:rPr>
+        <w:t xml:space="preserve">• </w:t>
+      </w:r>
+      <w:r>
+        <w:rPr>
+          <w:sz w:val="22"/>
+          <w:szCs w:val="22"/>
+        </w:rPr>
+        <w:t xml:space="preserve">Gắn Đơn hàng bán / Container / Lệnh điều động. "Đã cân là được" — số cân gồm pallet/bao bì, không so kế hoạch.</w:t>
+      </w:r>
+    </w:p>
+    <w:p>
+      <w:pPr>
+        <w:ind w:left="120"/>
+        <w:spacing w:after="30" w:line="276" w:lineRule="auto"/>
+      </w:pPr>
+      <w:r>
+        <w:rPr>
+          <w:b/>
+          <w:color w:val="1B4D3E"/>
+          <w:sz w:val="24"/>
+          <w:szCs w:val="24"/>
+        </w:rPr>
+        <w:t xml:space="preserve">③ CỔNG (hàng nội bộ) — cân hàng đi nội bộ</w:t>
+      </w:r>
+    </w:p>
+    <w:p>
+      <w:pPr>
+        <w:ind w:left="240"/>
+        <w:spacing w:after="70" w:line="276" w:lineRule="auto"/>
+      </w:pPr>
+      <w:r>
+        <w:rPr>
+          <w:b/>
+          <w:sz w:val="22"/>
+          <w:szCs w:val="22"/>
+        </w:rPr>
+        <w:t xml:space="preserve">• </w:t>
+      </w:r>
+      <w:r>
+        <w:rPr>
+          <w:sz w:val="22"/>
+          <w:szCs w:val="22"/>
+        </w:rPr>
+        <w:t xml:space="preserve">Hàng luân chuyển nội bộ, không nhập/xuất kho chính thức. Cân vào → ra, chênh lệch = hàng. Không gắn đơn/nguồn. (Chỉ Phong Điền.)</w:t>
+      </w:r>
+    </w:p>
+    <w:p>
+      <w:pPr>
+        <w:spacing w:after="100" w:line="276" w:lineRule="auto"/>
+      </w:pPr>
+      <w:r>
+        <w:rPr>
+          <w:b/>
+          <w:color w:val="1B4D3E"/>
+          <w:sz w:val="28"/>
+          <w:szCs w:val="28"/>
+        </w:rPr>
+        <w:t xml:space="preserve">A. Cân NHẬP — từng bước</w:t>
+      </w:r>
+    </w:p>
+    <w:p>
+      <w:pPr>
+        <w:spacing w:after="50" w:line="276" w:lineRule="auto"/>
+      </w:pPr>
+      <w:r>
+        <w:rPr>
+          <w:b/>
+          <w:color w:val="1B4D3E"/>
+          <w:sz w:val="26"/>
+          <w:szCs w:val="26"/>
+        </w:rPr>
+        <w:t xml:space="preserve">Bước 1.  </w:t>
+      </w:r>
+      <w:r>
+        <w:rPr>
+          <w:b/>
+          <w:sz w:val="26"/>
+          <w:szCs w:val="26"/>
+        </w:rPr>
+        <w:t xml:space="preserve">Chọn loại phiếu = NHẬP (vào kho)</w:t>
+      </w:r>
+    </w:p>
+    <w:p>
+      <w:pPr>
+        <w:jc w:val="center"/>
+        <w:spacing w:after="60"/>
+      </w:pPr>
+      <w:r>
+        <w:drawing>
+          <wp:inline xmlns:wp="http://schemas.openxmlformats.org/drawingml/2006/wordprocessingDrawing" distT="0" distB="0" distL="0" distR="0">
+            <wp:extent cx="5850000" cy="872437"/>
+            <wp:effectExtent l="0" t="0" r="0" b="0"/>
+            <wp:docPr id="102" name="Picture 102"/>
+            <wp:cNvGraphicFramePr>
+              <a:graphicFrameLocks xmlns:a="http://schemas.openxmlformats.org/drawingml/2006/main" noChangeAspect="1"/>
+            </wp:cNvGraphicFramePr>
+            <a:graphic xmlns:a="http://schemas.openxmlformats.org/drawingml/2006/main">
+              <a:graphicData uri="http://schemas.openxmlformats.org/drawingml/2006/picture">
+                <pic:pic xmlns:pic="http://schemas.openxmlformats.org/drawingml/2006/picture">
+                  <pic:nvPicPr>
+                    <pic:cNvPr id="102" name="img102"/>
+                    <pic:cNvPicPr/>
+                  </pic:nvPicPr>
+                  <pic:blipFill>
+                    <a:blip r:embed="rIdImg902"/>
+                    <a:stretch>
+                      <a:fillRect/>
+                    </a:stretch>
+                  </pic:blipFill>
+                  <pic:spPr>
+                    <a:xfrm>
+                      <a:off x="0" y="0"/>
+                      <a:ext cx="5850000" cy="872437"/>
+                    </a:xfrm>
+                    <a:prstGeom prst="rect">
+                      <a:avLst/>
+                    </a:prstGeom>
+                  </pic:spPr>
+                </pic:pic>
+              </a:graphicData>
+            </a:graphic>
+          </wp:inline>
+        </w:drawing>
+      </w:r>
+    </w:p>
+    <w:p>
+      <w:pPr>
+        <w:jc w:val="center"/>
+        <w:spacing w:after="200" w:line="276" w:lineRule="auto"/>
+      </w:pPr>
+      <w:r>
+        <w:rPr>
+          <w:i/>
+          <w:color w:val="9CA3AF"/>
+          <w:sz w:val="18"/>
+          <w:szCs w:val="18"/>
+        </w:rPr>
+        <w:t xml:space="preserve">Đã chọn NHẬP (vào kho)</w:t>
+      </w:r>
+    </w:p>
+    <w:p>
+      <w:pPr>
+        <w:spacing w:after="50" w:line="276" w:lineRule="auto"/>
+      </w:pPr>
+      <w:r>
+        <w:rPr>
+          <w:b/>
+          <w:color w:val="1B4D3E"/>
+          <w:sz w:val="26"/>
+          <w:szCs w:val="26"/>
+        </w:rPr>
+        <w:t xml:space="preserve">Bước 2.  </w:t>
+      </w:r>
+      <w:r>
+        <w:rPr>
+          <w:b/>
+          <w:sz w:val="26"/>
+          <w:szCs w:val="26"/>
+        </w:rPr>
+        <w:t xml:space="preserve">Chọn nguồn mủ / đối tác</w:t>
+      </w:r>
+    </w:p>
+    <w:p>
+      <w:pPr>
+        <w:ind w:left="240"/>
+        <w:spacing w:after="70" w:line="276" w:lineRule="auto"/>
+      </w:pPr>
+      <w:r>
+        <w:rPr>
+          <w:b/>
+          <w:sz w:val="22"/>
+          <w:szCs w:val="22"/>
+        </w:rPr>
+        <w:t xml:space="preserve">• </w:t>
+      </w:r>
+      <w:r>
+        <w:rPr>
+          <w:sz w:val="22"/>
+          <w:szCs w:val="22"/>
+        </w:rPr>
+        <w:t xml:space="preserve">Gõ tên / SĐT / mã để tìm đại lý B2B hoặc NCC (Lào / Việt) → chọn.</w:t>
+      </w:r>
+    </w:p>
+    <w:p>
+      <w:pPr>
+        <w:jc w:val="center"/>
+        <w:spacing w:after="60"/>
+      </w:pPr>
+      <w:r>
+        <w:drawing>
+          <wp:inline xmlns:wp="http://schemas.openxmlformats.org/drawingml/2006/wordprocessingDrawing" distT="0" distB="0" distL="0" distR="0">
+            <wp:extent cx="5850000" cy="2081028"/>
+            <wp:effectExtent l="0" t="0" r="0" b="0"/>
+            <wp:docPr id="103" name="Picture 103"/>
+            <wp:cNvGraphicFramePr>
+              <a:graphicFrameLocks xmlns:a="http://schemas.openxmlformats.org/drawingml/2006/main" noChangeAspect="1"/>
+            </wp:cNvGraphicFramePr>
+            <a:graphic xmlns:a="http://schemas.openxmlformats.org/drawingml/2006/main">
+              <a:graphicData uri="http://schemas.openxmlformats.org/drawingml/2006/picture">
+                <pic:pic xmlns:pic="http://schemas.openxmlformats.org/drawingml/2006/picture">
+                  <pic:nvPicPr>
+                    <pic:cNvPr id="103" name="img103"/>
+                    <pic:cNvPicPr/>
+                  </pic:nvPicPr>
+                  <pic:blipFill>
+                    <a:blip r:embed="rIdImg903"/>
+                    <a:stretch>
+                      <a:fillRect/>
+                    </a:stretch>
+                  </pic:blipFill>
+                  <pic:spPr>
+                    <a:xfrm>
+                      <a:off x="0" y="0"/>
+                      <a:ext cx="5850000" cy="2081028"/>
+                    </a:xfrm>
+                    <a:prstGeom prst="rect">
+                      <a:avLst/>
+                    </a:prstGeom>
+                  </pic:spPr>
+                </pic:pic>
+              </a:graphicData>
+            </a:graphic>
+          </wp:inline>
+        </w:drawing>
+      </w:r>
+    </w:p>
+    <w:p>
+      <w:pPr>
+        <w:jc w:val="center"/>
+        <w:spacing w:after="200" w:line="276" w:lineRule="auto"/>
+      </w:pPr>
+      <w:r>
+        <w:rPr>
+          <w:i/>
+          <w:color w:val="9CA3AF"/>
+          <w:sz w:val="18"/>
+          <w:szCs w:val="18"/>
+        </w:rPr>
+        <w:t xml:space="preserve">Tìm + chọn nguồn mủ (đối tác / NCC)</w:t>
+      </w:r>
+    </w:p>
+    <w:p>
+      <w:pPr>
+        <w:spacing w:after="50" w:line="276" w:lineRule="auto"/>
+      </w:pPr>
+      <w:r>
+        <w:rPr>
+          <w:b/>
+          <w:color w:val="1B4D3E"/>
+          <w:sz w:val="26"/>
+          <w:szCs w:val="26"/>
+        </w:rPr>
+        <w:t xml:space="preserve">Bước 3.  </w:t>
+      </w:r>
+      <w:r>
+        <w:rPr>
+          <w:b/>
+          <w:sz w:val="26"/>
+          <w:szCs w:val="26"/>
+        </w:rPr>
+        <w:t xml:space="preserve">Chọn loại mủ</w:t>
+      </w:r>
+    </w:p>
+    <w:p>
+      <w:pPr>
+        <w:ind w:left="240"/>
+        <w:spacing w:after="70" w:line="276" w:lineRule="auto"/>
+      </w:pPr>
+      <w:r>
+        <w:rPr>
+          <w:b/>
+          <w:sz w:val="22"/>
+          <w:szCs w:val="22"/>
+        </w:rPr>
+        <w:t xml:space="preserve">• </w:t>
+      </w:r>
+      <w:r>
+        <w:rPr>
+          <w:sz w:val="22"/>
+          <w:szCs w:val="22"/>
+        </w:rPr>
+        <w:t xml:space="preserve">💧 Mủ nước · 🪨 Mủ tạp · 🥣 Mủ chén · 📄 Mủ tờ · 🟫 Mủ RSS3. (Mủ nước tính theo DRC.)</w:t>
+      </w:r>
+    </w:p>
+    <w:p>
+      <w:pPr>
+        <w:jc w:val="center"/>
+        <w:spacing w:after="60"/>
+      </w:pPr>
+      <w:r>
+        <w:drawing>
+          <wp:inline xmlns:wp="http://schemas.openxmlformats.org/drawingml/2006/wordprocessingDrawing" distT="0" distB="0" distL="0" distR="0">
+            <wp:extent cx="5850000" cy="823391"/>
+            <wp:effectExtent l="0" t="0" r="0" b="0"/>
+            <wp:docPr id="104" name="Picture 104"/>
+            <wp:cNvGraphicFramePr>
+              <a:graphicFrameLocks xmlns:a="http://schemas.openxmlformats.org/drawingml/2006/main" noChangeAspect="1"/>
+            </wp:cNvGraphicFramePr>
+            <a:graphic xmlns:a="http://schemas.openxmlformats.org/drawingml/2006/main">
+              <a:graphicData uri="http://schemas.openxmlformats.org/drawingml/2006/picture">
+                <pic:pic xmlns:pic="http://schemas.openxmlformats.org/drawingml/2006/picture">
+                  <pic:nvPicPr>
+                    <pic:cNvPr id="104" name="img104"/>
+                    <pic:cNvPicPr/>
+                  </pic:nvPicPr>
+                  <pic:blipFill>
+                    <a:blip r:embed="rIdImg904"/>
+                    <a:stretch>
+                      <a:fillRect/>
+                    </a:stretch>
+                  </pic:blipFill>
+                  <pic:spPr>
+                    <a:xfrm>
+                      <a:off x="0" y="0"/>
+                      <a:ext cx="5850000" cy="823391"/>
+                    </a:xfrm>
+                    <a:prstGeom prst="rect">
+                      <a:avLst/>
+                    </a:prstGeom>
+                  </pic:spPr>
+                </pic:pic>
+              </a:graphicData>
+            </a:graphic>
+          </wp:inline>
+        </w:drawing>
+      </w:r>
+    </w:p>
+    <w:p>
+      <w:pPr>
+        <w:jc w:val="center"/>
+        <w:spacing w:after="200" w:line="276" w:lineRule="auto"/>
+      </w:pPr>
+      <w:r>
+        <w:rPr>
+          <w:i/>
+          <w:color w:val="9CA3AF"/>
+          <w:sz w:val="18"/>
+          <w:szCs w:val="18"/>
+        </w:rPr>
+        <w:t xml:space="preserve">Thanh chọn loại mủ</w:t>
+      </w:r>
+    </w:p>
+    <w:p>
+      <w:pPr>
+        <w:spacing w:after="50" w:line="276" w:lineRule="auto"/>
+      </w:pPr>
+      <w:r>
+        <w:rPr>
+          <w:b/>
+          <w:color w:val="1B4D3E"/>
+          <w:sz w:val="26"/>
+          <w:szCs w:val="26"/>
+        </w:rPr>
+        <w:t xml:space="preserve">Bước 4.  </w:t>
+      </w:r>
+      <w:r>
+        <w:rPr>
+          <w:b/>
+          <w:sz w:val="26"/>
+          <w:szCs w:val="26"/>
+        </w:rPr>
+        <w:t xml:space="preserve">Nhập biển số xe + tài xế</w:t>
+      </w:r>
+    </w:p>
+    <w:p>
+      <w:pPr>
+        <w:jc w:val="center"/>
+        <w:spacing w:after="60"/>
+      </w:pPr>
+      <w:r>
+        <w:drawing>
+          <wp:inline xmlns:wp="http://schemas.openxmlformats.org/drawingml/2006/wordprocessingDrawing" distT="0" distB="0" distL="0" distR="0">
+            <wp:extent cx="5850000" cy="1361176"/>
+            <wp:effectExtent l="0" t="0" r="0" b="0"/>
+            <wp:docPr id="105" name="Picture 105"/>
+            <wp:cNvGraphicFramePr>
+              <a:graphicFrameLocks xmlns:a="http://schemas.openxmlformats.org/drawingml/2006/main" noChangeAspect="1"/>
+            </wp:cNvGraphicFramePr>
+            <a:graphic xmlns:a="http://schemas.openxmlformats.org/drawingml/2006/main">
+              <a:graphicData uri="http://schemas.openxmlformats.org/drawingml/2006/picture">
+                <pic:pic xmlns:pic="http://schemas.openxmlformats.org/drawingml/2006/picture">
+                  <pic:nvPicPr>
+                    <pic:cNvPr id="105" name="img105"/>
+                    <pic:cNvPicPr/>
+                  </pic:nvPicPr>
+                  <pic:blipFill>
+                    <a:blip r:embed="rIdImg905"/>
+                    <a:stretch>
+                      <a:fillRect/>
+                    </a:stretch>
+                  </pic:blipFill>
+                  <pic:spPr>
+                    <a:xfrm>
+                      <a:off x="0" y="0"/>
+                      <a:ext cx="5850000" cy="1361176"/>
+                    </a:xfrm>
+                    <a:prstGeom prst="rect">
+                      <a:avLst/>
+                    </a:prstGeom>
+                  </pic:spPr>
+                </pic:pic>
+              </a:graphicData>
+            </a:graphic>
+          </wp:inline>
+        </w:drawing>
+      </w:r>
+    </w:p>
+    <w:p>
+      <w:pPr>
+        <w:jc w:val="center"/>
+        <w:spacing w:after="200" w:line="276" w:lineRule="auto"/>
+      </w:pPr>
+      <w:r>
+        <w:rPr>
+          <w:i/>
+          <w:color w:val="9CA3AF"/>
+          <w:sz w:val="18"/>
+          <w:szCs w:val="18"/>
+        </w:rPr>
+        <w:t xml:space="preserve">Thông tin vận chuyển — biển số xe, tài xế</w:t>
+      </w:r>
+    </w:p>
+    <w:p>
+      <w:pPr>
+        <w:spacing w:after="50" w:line="276" w:lineRule="auto"/>
+      </w:pPr>
+      <w:r>
+        <w:rPr>
+          <w:b/>
+          <w:color w:val="1B4D3E"/>
+          <w:sz w:val="26"/>
+          <w:szCs w:val="26"/>
+        </w:rPr>
+        <w:t xml:space="preserve">Bước 5.  </w:t>
+      </w:r>
+      <w:r>
+        <w:rPr>
+          <w:b/>
+          <w:sz w:val="26"/>
+          <w:szCs w:val="26"/>
+        </w:rPr>
+        <w:t xml:space="preserve">(Tùy chọn) Ghi chú mã hàng / lô hàng</w:t>
+      </w:r>
+    </w:p>
+    <w:p>
+      <w:pPr>
+        <w:ind w:left="240"/>
+        <w:spacing w:after="70" w:line="276" w:lineRule="auto"/>
+      </w:pPr>
+      <w:r>
+        <w:rPr>
+          <w:b/>
+          <w:sz w:val="22"/>
+          <w:szCs w:val="22"/>
+        </w:rPr>
+        <w:t xml:space="preserve">• </w:t>
+      </w:r>
+      <w:r>
+        <w:rPr>
+          <w:sz w:val="22"/>
+          <w:szCs w:val="22"/>
+        </w:rPr>
+        <w:t xml:space="preserve">Nhập mã hàng / lô để in lên phiếu (nếu cần).</w:t>
+      </w:r>
+    </w:p>
+    <w:p>
+      <w:pPr>
+        <w:jc w:val="center"/>
+        <w:spacing w:after="60"/>
+      </w:pPr>
+      <w:r>
+        <w:drawing>
+          <wp:inline xmlns:wp="http://schemas.openxmlformats.org/drawingml/2006/wordprocessingDrawing" distT="0" distB="0" distL="0" distR="0">
+            <wp:extent cx="5850000" cy="784021"/>
+            <wp:effectExtent l="0" t="0" r="0" b="0"/>
+            <wp:docPr id="106" name="Picture 106"/>
+            <wp:cNvGraphicFramePr>
+              <a:graphicFrameLocks xmlns:a="http://schemas.openxmlformats.org/drawingml/2006/main" noChangeAspect="1"/>
+            </wp:cNvGraphicFramePr>
+            <a:graphic xmlns:a="http://schemas.openxmlformats.org/drawingml/2006/main">
+              <a:graphicData uri="http://schemas.openxmlformats.org/drawingml/2006/picture">
+                <pic:pic xmlns:pic="http://schemas.openxmlformats.org/drawingml/2006/picture">
+                  <pic:nvPicPr>
+                    <pic:cNvPr id="106" name="img106"/>
+                    <pic:cNvPicPr/>
+                  </pic:nvPicPr>
+                  <pic:blipFill>
+                    <a:blip r:embed="rIdImg906"/>
+                    <a:stretch>
+                      <a:fillRect/>
+                    </a:stretch>
+                  </pic:blipFill>
+                  <pic:spPr>
+                    <a:xfrm>
+                      <a:off x="0" y="0"/>
+                      <a:ext cx="5850000" cy="784021"/>
+                    </a:xfrm>
+                    <a:prstGeom prst="rect">
+                      <a:avLst/>
+                    </a:prstGeom>
+                  </pic:spPr>
+                </pic:pic>
+              </a:graphicData>
+            </a:graphic>
+          </wp:inline>
+        </w:drawing>
+      </w:r>
+    </w:p>
+    <w:p>
+      <w:pPr>
+        <w:jc w:val="center"/>
+        <w:spacing w:after="200" w:line="276" w:lineRule="auto"/>
+      </w:pPr>
+      <w:r>
+        <w:rPr>
+          <w:i/>
+          <w:color w:val="9CA3AF"/>
+          <w:sz w:val="18"/>
+          <w:szCs w:val="18"/>
+        </w:rPr>
+        <w:t xml:space="preserve">Ô ghi chú mã hàng / lô hàng</w:t>
+      </w:r>
+    </w:p>
+    <w:p>
+      <w:pPr>
+        <w:spacing w:after="50" w:line="276" w:lineRule="auto"/>
+      </w:pPr>
+      <w:r>
+        <w:rPr>
+          <w:b/>
+          <w:color w:val="1B4D3E"/>
+          <w:sz w:val="26"/>
+          <w:szCs w:val="26"/>
+        </w:rPr>
+        <w:t xml:space="preserve">Bước 6.  </w:t>
+      </w:r>
+      <w:r>
+        <w:rPr>
+          <w:b/>
+          <w:sz w:val="26"/>
+          <w:szCs w:val="26"/>
+        </w:rPr>
+        <w:t xml:space="preserve">Bấm "Tạo phiếu &amp; Bắt đầu cân"</w:t>
+      </w:r>
+    </w:p>
+    <w:p>
+      <w:pPr>
+        <w:jc w:val="center"/>
+        <w:spacing w:after="60"/>
+      </w:pPr>
+      <w:r>
+        <w:drawing>
+          <wp:inline xmlns:wp="http://schemas.openxmlformats.org/drawingml/2006/wordprocessingDrawing" distT="0" distB="0" distL="0" distR="0">
+            <wp:extent cx="5850000" cy="232836"/>
+            <wp:effectExtent l="0" t="0" r="0" b="0"/>
+            <wp:docPr id="107" name="Picture 107"/>
+            <wp:cNvGraphicFramePr>
+              <a:graphicFrameLocks xmlns:a="http://schemas.openxmlformats.org/drawingml/2006/main" noChangeAspect="1"/>
+            </wp:cNvGraphicFramePr>
+            <a:graphic xmlns:a="http://schemas.openxmlformats.org/drawingml/2006/main">
+              <a:graphicData uri="http://schemas.openxmlformats.org/drawingml/2006/picture">
+                <pic:pic xmlns:pic="http://schemas.openxmlformats.org/drawingml/2006/picture">
+                  <pic:nvPicPr>
+                    <pic:cNvPr id="107" name="img107"/>
+                    <pic:cNvPicPr/>
+                  </pic:nvPicPr>
+                  <pic:blipFill>
+                    <a:blip r:embed="rIdImg907"/>
+                    <a:stretch>
+                      <a:fillRect/>
+                    </a:stretch>
+                  </pic:blipFill>
+                  <pic:spPr>
+                    <a:xfrm>
+                      <a:off x="0" y="0"/>
+                      <a:ext cx="5850000" cy="232836"/>
+                    </a:xfrm>
+                    <a:prstGeom prst="rect">
+                      <a:avLst/>
+                    </a:prstGeom>
+                  </pic:spPr>
+                </pic:pic>
+              </a:graphicData>
+            </a:graphic>
+          </wp:inline>
+        </w:drawing>
+      </w:r>
+    </w:p>
+    <w:p>
+      <w:pPr>
+        <w:jc w:val="center"/>
+        <w:spacing w:after="200" w:line="276" w:lineRule="auto"/>
+      </w:pPr>
+      <w:r>
+        <w:rPr>
+          <w:i/>
+          <w:color w:val="9CA3AF"/>
+          <w:sz w:val="18"/>
+          <w:szCs w:val="18"/>
+        </w:rPr>
+        <w:t xml:space="preserve">Nút Tạo phiếu &amp; Bắt đầu cân</w:t>
+      </w:r>
+    </w:p>
+    <w:p>
+      <w:pPr>
+        <w:spacing w:after="50" w:line="276" w:lineRule="auto"/>
+      </w:pPr>
+      <w:r>
+        <w:rPr>
+          <w:b/>
+          <w:color w:val="1B4D3E"/>
+          <w:sz w:val="26"/>
+          <w:szCs w:val="26"/>
+        </w:rPr>
+        <w:t xml:space="preserve">Bước 7.  </w:t>
+      </w:r>
+      <w:r>
+        <w:rPr>
+          <w:b/>
+          <w:sz w:val="26"/>
+          <w:szCs w:val="26"/>
+        </w:rPr>
+        <w:t xml:space="preserve">Cân lần 1 — Gross (xe + hàng) + chụp 3 ảnh</w:t>
+      </w:r>
+    </w:p>
+    <w:p>
+      <w:pPr>
+        <w:ind w:left="240"/>
+        <w:spacing w:after="70" w:line="276" w:lineRule="auto"/>
+      </w:pPr>
+      <w:r>
+        <w:rPr>
+          <w:b/>
+          <w:sz w:val="22"/>
+          <w:szCs w:val="22"/>
+        </w:rPr>
+        <w:t xml:space="preserve">• </w:t>
+      </w:r>
+      <w:r>
+        <w:rPr>
+          <w:sz w:val="22"/>
+          <w:szCs w:val="22"/>
+        </w:rPr>
+        <w:t xml:space="preserve">Xe chở hàng lên bàn cân → lấy số cân lần 1. Chụp đủ 3 ảnh: Trước xe · Sau xe · Tài xế.</w:t>
       </w:r>
     </w:p>
     <w:tbl>
@@ -95,20 +975,14 @@
           <w:left w:val="dashed" w:sz="10" w:space="0" w:color="9CA3AF"/>
           <w:bottom w:val="dashed" w:sz="10" w:space="0" w:color="9CA3AF"/>
           <w:right w:val="dashed" w:sz="10" w:space="0" w:color="9CA3AF"/>
-          <w:insideH w:val="dashed" w:sz="10" w:space="0" w:color="9CA3AF"/>
-          <w:insideV w:val="dashed" w:sz="10" w:space="0" w:color="9CA3AF"/>
         </w:tblBorders>
-        <w:tblCellMar>
-          <w:top w:w="80" w:type="dxa"/>
-          <w:bottom w:w="80" w:type="dxa"/>
-        </w:tblCellMar>
       </w:tblPr>
       <w:tblGrid>
         <w:gridCol w:w="9300"/>
       </w:tblGrid>
       <w:tr>
         <w:trPr>
-          <w:trHeight w:val="2400"/>
+          <w:trHeight w:val="2600"/>
         </w:trPr>
         <w:tc>
           <w:tcPr>
@@ -125,7 +999,7 @@
                 <w:color w:val="9CA3AF"/>
                 <w:sz w:val="22"/>
               </w:rPr>
-              <w:t xml:space="preserve">📷 Hình 1 — Màn hình chính App Cân (sau khi đăng nhập)</w:t>
+              <w:t xml:space="preserve">📷 Màn hình cân lần 1 (Gross) + chụp ảnh — (chưa có ảnh, dán vào đây)</w:t>
             </w:r>
           </w:p>
         </w:tc>
@@ -138,16 +1012,167 @@
     </w:p>
     <w:p>
       <w:pPr>
-        <w:spacing w:after="100" w:line="276" w:lineRule="auto"/>
+        <w:spacing w:after="50" w:line="276" w:lineRule="auto"/>
       </w:pPr>
       <w:r>
         <w:rPr>
           <w:b/>
           <w:color w:val="1B4D3E"/>
-          <w:sz w:val="28"/>
-          <w:szCs w:val="28"/>
-        </w:rPr>
-        <w:t xml:space="preserve">3 loại phiếu cân — chọn đúng ngay từ đầu</w:t>
+          <w:sz w:val="26"/>
+          <w:szCs w:val="26"/>
+        </w:rPr>
+        <w:t xml:space="preserve">Bước 8.  </w:t>
+      </w:r>
+      <w:r>
+        <w:rPr>
+          <w:b/>
+          <w:sz w:val="26"/>
+          <w:szCs w:val="26"/>
+        </w:rPr>
+        <w:t xml:space="preserve">Cân lần 2 — Tare (xe rỗng) → Net → Hoàn tất → IN PHIẾU</w:t>
+      </w:r>
+    </w:p>
+    <w:p>
+      <w:pPr>
+        <w:ind w:left="240"/>
+        <w:spacing w:after="70" w:line="276" w:lineRule="auto"/>
+      </w:pPr>
+      <w:r>
+        <w:rPr>
+          <w:b/>
+          <w:sz w:val="22"/>
+          <w:szCs w:val="22"/>
+        </w:rPr>
+        <w:t xml:space="preserve">• </w:t>
+      </w:r>
+      <w:r>
+        <w:rPr>
+          <w:sz w:val="22"/>
+          <w:szCs w:val="22"/>
+        </w:rPr>
+        <w:t xml:space="preserve">Đổ hàng xong, xe rỗng lên cân → lấy số cân lần 2. Hệ thống ra NET = Lần 1 − Lần 2.</w:t>
+      </w:r>
+    </w:p>
+    <w:p>
+      <w:pPr>
+        <w:ind w:left="240"/>
+        <w:spacing w:after="70" w:line="276" w:lineRule="auto"/>
+      </w:pPr>
+      <w:r>
+        <w:rPr>
+          <w:b/>
+          <w:sz w:val="22"/>
+          <w:szCs w:val="22"/>
+        </w:rPr>
+        <w:t xml:space="preserve">• </w:t>
+      </w:r>
+      <w:r>
+        <w:rPr>
+          <w:sz w:val="22"/>
+          <w:szCs w:val="22"/>
+        </w:rPr>
+        <w:t xml:space="preserve">Kiểm lại → bấm Hoàn tất → bấm IN PHIẾU (giao tài xế 1 bản).</w:t>
+      </w:r>
+    </w:p>
+    <w:p>
+      <w:pPr>
+        <w:jc w:val="center"/>
+        <w:spacing w:after="60"/>
+      </w:pPr>
+      <w:r>
+        <w:drawing>
+          <wp:inline xmlns:wp="http://schemas.openxmlformats.org/drawingml/2006/wordprocessingDrawing" distT="0" distB="0" distL="0" distR="0">
+            <wp:extent cx="5850000" cy="3733649"/>
+            <wp:effectExtent l="0" t="0" r="0" b="0"/>
+            <wp:docPr id="108" name="Picture 108"/>
+            <wp:cNvGraphicFramePr>
+              <a:graphicFrameLocks xmlns:a="http://schemas.openxmlformats.org/drawingml/2006/main" noChangeAspect="1"/>
+            </wp:cNvGraphicFramePr>
+            <a:graphic xmlns:a="http://schemas.openxmlformats.org/drawingml/2006/main">
+              <a:graphicData uri="http://schemas.openxmlformats.org/drawingml/2006/picture">
+                <pic:pic xmlns:pic="http://schemas.openxmlformats.org/drawingml/2006/picture">
+                  <pic:nvPicPr>
+                    <pic:cNvPr id="108" name="img108"/>
+                    <pic:cNvPicPr/>
+                  </pic:nvPicPr>
+                  <pic:blipFill>
+                    <a:blip r:embed="rIdImg908"/>
+                    <a:stretch>
+                      <a:fillRect/>
+                    </a:stretch>
+                  </pic:blipFill>
+                  <pic:spPr>
+                    <a:xfrm>
+                      <a:off x="0" y="0"/>
+                      <a:ext cx="5850000" cy="3733649"/>
+                    </a:xfrm>
+                    <a:prstGeom prst="rect">
+                      <a:avLst/>
+                    </a:prstGeom>
+                  </pic:spPr>
+                </pic:pic>
+              </a:graphicData>
+            </a:graphic>
+          </wp:inline>
+        </w:drawing>
+      </w:r>
+    </w:p>
+    <w:p>
+      <w:pPr>
+        <w:jc w:val="center"/>
+        <w:spacing w:after="200" w:line="276" w:lineRule="auto"/>
+      </w:pPr>
+      <w:r>
+        <w:rPr>
+          <w:i/>
+          <w:color w:val="9CA3AF"/>
+          <w:sz w:val="18"/>
+          <w:szCs w:val="18"/>
+        </w:rPr>
+        <w:t xml:space="preserve">Phiếu hoàn tất — Net + 3 ảnh + nút IN PHIẾU</w:t>
+      </w:r>
+    </w:p>
+    <w:p>
+      <w:pPr>
+        <w:spacing w:after="50" w:line="276" w:lineRule="auto"/>
+      </w:pPr>
+      <w:r>
+        <w:rPr>
+          <w:b/>
+          <w:color w:val="1B4D3E"/>
+          <w:sz w:val="26"/>
+          <w:szCs w:val="26"/>
+        </w:rPr>
+        <w:t xml:space="preserve">Bước 9.  </w:t>
+      </w:r>
+      <w:r>
+        <w:rPr>
+          <w:b/>
+          <w:sz w:val="26"/>
+          <w:szCs w:val="26"/>
+        </w:rPr>
+        <w:t xml:space="preserve">(Chỉ Mủ nước) Nhập DRC</w:t>
+      </w:r>
+    </w:p>
+    <w:p>
+      <w:pPr>
+        <w:ind w:left="240"/>
+        <w:spacing w:after="70" w:line="276" w:lineRule="auto"/>
+      </w:pPr>
+      <w:r>
+        <w:rPr>
+          <w:b/>
+          <w:sz w:val="22"/>
+          <w:szCs w:val="22"/>
+        </w:rPr>
+        <w:t xml:space="preserve">• </w:t>
+      </w:r>
+      <w:r>
+        <w:rPr>
+          <w:sz w:val="22"/>
+          <w:szCs w:val="22"/>
+        </w:rPr>
+        <w:t xml:space="preserve">Với mủ nước: nhập/tra DRC% để ra khối lượng khô + thành tiền.</w:t>
       </w:r>
     </w:p>
     <w:tbl>
@@ -158,20 +1183,14 @@
           <w:left w:val="dashed" w:sz="10" w:space="0" w:color="9CA3AF"/>
           <w:bottom w:val="dashed" w:sz="10" w:space="0" w:color="9CA3AF"/>
           <w:right w:val="dashed" w:sz="10" w:space="0" w:color="9CA3AF"/>
-          <w:insideH w:val="dashed" w:sz="10" w:space="0" w:color="9CA3AF"/>
-          <w:insideV w:val="dashed" w:sz="10" w:space="0" w:color="9CA3AF"/>
         </w:tblBorders>
-        <w:tblCellMar>
-          <w:top w:w="80" w:type="dxa"/>
-          <w:bottom w:w="80" w:type="dxa"/>
-        </w:tblCellMar>
       </w:tblPr>
       <w:tblGrid>
         <w:gridCol w:w="9300"/>
       </w:tblGrid>
       <w:tr>
         <w:trPr>
-          <w:trHeight w:val="1500"/>
+          <w:trHeight w:val="1400"/>
         </w:trPr>
         <w:tc>
           <w:tcPr>
@@ -188,7 +1207,7 @@
                 <w:color w:val="9CA3AF"/>
                 <w:sz w:val="22"/>
               </w:rPr>
-              <w:t xml:space="preserve">📷 Hình 2 — Thanh chọn loại phiếu: NHẬP · XUẤT · CỔNG</w:t>
+              <w:t xml:space="preserve">📷 Ô nhập DRC (chỉ hiện với Mủ nước) — (chưa có ảnh, dán vào đây)</w:t>
             </w:r>
           </w:p>
         </w:tc>
@@ -201,177 +1220,6 @@
     </w:p>
     <w:p>
       <w:pPr>
-        <w:ind w:left="120"/>
-        <w:spacing w:after="30" w:line="276" w:lineRule="auto"/>
-      </w:pPr>
-      <w:r>
-        <w:rPr>
-          <w:b/>
-          <w:color w:val="1B4D3E"/>
-          <w:sz w:val="24"/>
-          <w:szCs w:val="24"/>
-        </w:rPr>
-        <w:t xml:space="preserve">① NHẬP (vào kho) — cân mủ từ nhà cung cấp / đại lý vào kho</w:t>
-      </w:r>
-    </w:p>
-    <w:p>
-      <w:pPr>
-        <w:ind w:left="240"/>
-        <w:spacing w:after="80" w:line="276" w:lineRule="auto"/>
-      </w:pPr>
-      <w:r>
-        <w:rPr>
-          <w:b/>
-          <w:sz w:val="22"/>
-          <w:szCs w:val="22"/>
-        </w:rPr>
-        <w:t xml:space="preserve">• </w:t>
-      </w:r>
-      <w:r>
-        <w:rPr>
-          <w:sz w:val="22"/>
-          <w:szCs w:val="22"/>
-        </w:rPr>
-        <w:t xml:space="preserve">Cân 2 lần: Gross (xe + hàng) vào  →  Tare (xe rỗng) ra  →  Net = Gross − Tare = khối lượng mủ.</w:t>
-      </w:r>
-    </w:p>
-    <w:p>
-      <w:pPr>
-        <w:ind w:left="240"/>
-        <w:spacing w:after="80" w:line="276" w:lineRule="auto"/>
-      </w:pPr>
-      <w:r>
-        <w:rPr>
-          <w:b/>
-          <w:sz w:val="22"/>
-          <w:szCs w:val="22"/>
-        </w:rPr>
-        <w:t xml:space="preserve">• </w:t>
-      </w:r>
-      <w:r>
-        <w:rPr>
-          <w:sz w:val="22"/>
-          <w:szCs w:val="22"/>
-        </w:rPr>
-        <w:t xml:space="preserve">Có gắn nguồn mủ + loại mủ; riêng Mủ nước nhập thêm DRC để ra khối lượng khô.</w:t>
-      </w:r>
-    </w:p>
-    <w:p>
-      <w:pPr>
-        <w:ind w:left="120"/>
-        <w:spacing w:after="30" w:line="276" w:lineRule="auto"/>
-      </w:pPr>
-      <w:r>
-        <w:rPr>
-          <w:b/>
-          <w:color w:val="1B4D3E"/>
-          <w:sz w:val="24"/>
-          <w:szCs w:val="24"/>
-        </w:rPr>
-        <w:t xml:space="preserve">② XUẤT (ra kho) — cân hàng xuất đi cảng / khách</w:t>
-      </w:r>
-    </w:p>
-    <w:p>
-      <w:pPr>
-        <w:ind w:left="240"/>
-        <w:spacing w:after="80" w:line="276" w:lineRule="auto"/>
-      </w:pPr>
-      <w:r>
-        <w:rPr>
-          <w:b/>
-          <w:sz w:val="22"/>
-          <w:szCs w:val="22"/>
-        </w:rPr>
-        <w:t xml:space="preserve">• </w:t>
-      </w:r>
-      <w:r>
-        <w:rPr>
-          <w:sz w:val="22"/>
-          <w:szCs w:val="22"/>
-        </w:rPr>
-        <w:t xml:space="preserve">Cân 2 lần NGƯỢC với nhập: Tare (xe rỗng) vào  →  Gross (xe + hàng) ra  →  Net = Gross − Tare.</w:t>
-      </w:r>
-    </w:p>
-    <w:p>
-      <w:pPr>
-        <w:ind w:left="240"/>
-        <w:spacing w:after="80" w:line="276" w:lineRule="auto"/>
-      </w:pPr>
-      <w:r>
-        <w:rPr>
-          <w:b/>
-          <w:sz w:val="22"/>
-          <w:szCs w:val="22"/>
-        </w:rPr>
-        <w:t xml:space="preserve">• </w:t>
-      </w:r>
-      <w:r>
-        <w:rPr>
-          <w:sz w:val="22"/>
-          <w:szCs w:val="22"/>
-        </w:rPr>
-        <w:t xml:space="preserve">Gắn Đơn hàng bán / Container / Lệnh điều động. Xe chở nhiều loại mủ → chọn nhiều loại.</w:t>
-      </w:r>
-    </w:p>
-    <w:p>
-      <w:pPr>
-        <w:ind w:left="240"/>
-        <w:spacing w:after="80" w:line="276" w:lineRule="auto"/>
-      </w:pPr>
-      <w:r>
-        <w:rPr>
-          <w:b/>
-          <w:sz w:val="22"/>
-          <w:szCs w:val="22"/>
-        </w:rPr>
-        <w:t xml:space="preserve">• </w:t>
-      </w:r>
-      <w:r>
-        <w:rPr>
-          <w:sz w:val="22"/>
-          <w:szCs w:val="22"/>
-        </w:rPr>
-        <w:t xml:space="preserve">"Đã cân là được" — số cân gồm cả pallet / bao bì, KHÔNG so với kế hoạch.</w:t>
-      </w:r>
-    </w:p>
-    <w:p>
-      <w:pPr>
-        <w:ind w:left="120"/>
-        <w:spacing w:after="30" w:line="276" w:lineRule="auto"/>
-      </w:pPr>
-      <w:r>
-        <w:rPr>
-          <w:b/>
-          <w:color w:val="1B4D3E"/>
-          <w:sz w:val="24"/>
-          <w:szCs w:val="24"/>
-        </w:rPr>
-        <w:t xml:space="preserve">③ CỔNG (hàng nội bộ) — cân cổng cho hàng đi nội bộ</w:t>
-      </w:r>
-    </w:p>
-    <w:p>
-      <w:pPr>
-        <w:ind w:left="240"/>
-        <w:spacing w:after="80" w:line="276" w:lineRule="auto"/>
-      </w:pPr>
-      <w:r>
-        <w:rPr>
-          <w:b/>
-          <w:sz w:val="22"/>
-          <w:szCs w:val="22"/>
-        </w:rPr>
-        <w:t xml:space="preserve">• </w:t>
-      </w:r>
-      <w:r>
-        <w:rPr>
-          <w:sz w:val="22"/>
-          <w:szCs w:val="22"/>
-        </w:rPr>
-        <w:t xml:space="preserve">Cân vào  →  ra, chênh lệch = hàng. KHÔNG gắn nguồn mủ / deal / đơn hàng. (Chỉ dùng ở Phong Điền.)</w:t>
-      </w:r>
-    </w:p>
-    <w:p>
-      <w:pPr>
         <w:spacing w:after="100" w:line="276" w:lineRule="auto"/>
       </w:pPr>
       <w:r>
@@ -381,29 +1229,142 @@
           <w:sz w:val="28"/>
           <w:szCs w:val="28"/>
         </w:rPr>
-        <w:t xml:space="preserve">A. Các bước cân NHẬP (chi tiết)</w:t>
-      </w:r>
-    </w:p>
-    <w:p>
-      <w:pPr>
-        <w:spacing w:after="60" w:line="276" w:lineRule="auto"/>
+        <w:t xml:space="preserve">B. Cân XUẤT đi cảng</w:t>
+      </w:r>
+    </w:p>
+    <w:p>
+      <w:pPr>
+        <w:ind w:left="240"/>
+        <w:spacing w:after="70" w:line="276" w:lineRule="auto"/>
+      </w:pPr>
+      <w:r>
+        <w:rPr>
+          <w:b/>
+          <w:sz w:val="22"/>
+          <w:szCs w:val="22"/>
+        </w:rPr>
+        <w:t xml:space="preserve">• </w:t>
+      </w:r>
+      <w:r>
+        <w:rPr>
+          <w:sz w:val="22"/>
+          <w:szCs w:val="22"/>
+        </w:rPr>
+        <w:t xml:space="preserve">Chọn loại phiếu = XUẤT → chọn Lệnh điều động (Mã · Xe · Tài xế) → app TỰ ĐIỀN xe/tài xế + hiện container của lệnh.</w:t>
+      </w:r>
+    </w:p>
+    <w:p>
+      <w:pPr>
+        <w:ind w:left="240"/>
+        <w:spacing w:after="70" w:line="276" w:lineRule="auto"/>
+      </w:pPr>
+      <w:r>
+        <w:rPr>
+          <w:b/>
+          <w:sz w:val="22"/>
+          <w:szCs w:val="22"/>
+        </w:rPr>
+        <w:t xml:space="preserve">• </w:t>
+      </w:r>
+      <w:r>
+        <w:rPr>
+          <w:sz w:val="22"/>
+          <w:szCs w:val="22"/>
+        </w:rPr>
+        <w:t xml:space="preserve">Cân Tare (xe rỗng) → Gross (xe + hàng) → Hoàn tất ("Đã cân"). Số cân tự đồng bộ về Lệnh điều động + Đơn hàng bán.</w:t>
+      </w:r>
+    </w:p>
+    <w:p>
+      <w:pPr>
+        <w:jc w:val="center"/>
+        <w:spacing w:after="60"/>
+      </w:pPr>
+      <w:r>
+        <w:drawing>
+          <wp:inline xmlns:wp="http://schemas.openxmlformats.org/drawingml/2006/wordprocessingDrawing" distT="0" distB="0" distL="0" distR="0">
+            <wp:extent cx="5850000" cy="3255410"/>
+            <wp:effectExtent l="0" t="0" r="0" b="0"/>
+            <wp:docPr id="109" name="Picture 109"/>
+            <wp:cNvGraphicFramePr>
+              <a:graphicFrameLocks xmlns:a="http://schemas.openxmlformats.org/drawingml/2006/main" noChangeAspect="1"/>
+            </wp:cNvGraphicFramePr>
+            <a:graphic xmlns:a="http://schemas.openxmlformats.org/drawingml/2006/main">
+              <a:graphicData uri="http://schemas.openxmlformats.org/drawingml/2006/picture">
+                <pic:pic xmlns:pic="http://schemas.openxmlformats.org/drawingml/2006/picture">
+                  <pic:nvPicPr>
+                    <pic:cNvPr id="109" name="img109"/>
+                    <pic:cNvPicPr/>
+                  </pic:nvPicPr>
+                  <pic:blipFill>
+                    <a:blip r:embed="rIdImg909"/>
+                    <a:stretch>
+                      <a:fillRect/>
+                    </a:stretch>
+                  </pic:blipFill>
+                  <pic:spPr>
+                    <a:xfrm>
+                      <a:off x="0" y="0"/>
+                      <a:ext cx="5850000" cy="3255410"/>
+                    </a:xfrm>
+                    <a:prstGeom prst="rect">
+                      <a:avLst/>
+                    </a:prstGeom>
+                  </pic:spPr>
+                </pic:pic>
+              </a:graphicData>
+            </a:graphic>
+          </wp:inline>
+        </w:drawing>
+      </w:r>
+    </w:p>
+    <w:p>
+      <w:pPr>
+        <w:jc w:val="center"/>
+        <w:spacing w:after="200" w:line="276" w:lineRule="auto"/>
+      </w:pPr>
+      <w:r>
+        <w:rPr>
+          <w:i/>
+          <w:color w:val="9CA3AF"/>
+          <w:sz w:val="18"/>
+          <w:szCs w:val="18"/>
+        </w:rPr>
+        <w:t xml:space="preserve">Cân XUẤT — chọn Lệnh điều động (auto-fill xe + container)</w:t>
+      </w:r>
+    </w:p>
+    <w:p>
+      <w:pPr>
+        <w:spacing w:after="100" w:line="276" w:lineRule="auto"/>
       </w:pPr>
       <w:r>
         <w:rPr>
           <w:b/>
           <w:color w:val="1B4D3E"/>
-          <w:sz w:val="26"/>
-          <w:szCs w:val="26"/>
-        </w:rPr>
-        <w:t xml:space="preserve">Bước 1.  </w:t>
-      </w:r>
-      <w:r>
-        <w:rPr>
-          <w:b/>
-          <w:sz w:val="26"/>
-          <w:szCs w:val="26"/>
-        </w:rPr>
-        <w:t xml:space="preserve">Chọn loại phiếu = NHẬP (vào kho)</w:t>
+          <w:sz w:val="28"/>
+          <w:szCs w:val="28"/>
+        </w:rPr>
+        <w:t xml:space="preserve">C. Cân CỔNG nội bộ</w:t>
+      </w:r>
+    </w:p>
+    <w:p>
+      <w:pPr>
+        <w:ind w:left="240"/>
+        <w:spacing w:after="70" w:line="276" w:lineRule="auto"/>
+      </w:pPr>
+      <w:r>
+        <w:rPr>
+          <w:b/>
+          <w:sz w:val="22"/>
+          <w:szCs w:val="22"/>
+        </w:rPr>
+        <w:t xml:space="preserve">• </w:t>
+      </w:r>
+      <w:r>
+        <w:rPr>
+          <w:sz w:val="22"/>
+          <w:szCs w:val="22"/>
+        </w:rPr>
+        <w:t xml:space="preserve">Chọn loại phiếu = CỔNG → cân vào → cân ra → chênh lệch = hàng. Không gắn đơn / nguồn mủ.</w:t>
       </w:r>
     </w:p>
     <w:tbl>
@@ -414,20 +1375,14 @@
           <w:left w:val="dashed" w:sz="10" w:space="0" w:color="9CA3AF"/>
           <w:bottom w:val="dashed" w:sz="10" w:space="0" w:color="9CA3AF"/>
           <w:right w:val="dashed" w:sz="10" w:space="0" w:color="9CA3AF"/>
-          <w:insideH w:val="dashed" w:sz="10" w:space="0" w:color="9CA3AF"/>
-          <w:insideV w:val="dashed" w:sz="10" w:space="0" w:color="9CA3AF"/>
         </w:tblBorders>
-        <w:tblCellMar>
-          <w:top w:w="80" w:type="dxa"/>
-          <w:bottom w:w="80" w:type="dxa"/>
-        </w:tblCellMar>
       </w:tblPr>
       <w:tblGrid>
         <w:gridCol w:w="9300"/>
       </w:tblGrid>
       <w:tr>
         <w:trPr>
-          <w:trHeight w:val="1500"/>
+          <w:trHeight w:val="2000"/>
         </w:trPr>
         <w:tc>
           <w:tcPr>
@@ -444,7 +1399,7 @@
                 <w:color w:val="9CA3AF"/>
                 <w:sz w:val="22"/>
               </w:rPr>
-              <w:t xml:space="preserve">📷 Hình 3 — đã chọn NHẬP</w:t>
+              <w:t xml:space="preserve">📷 Màn hình cân CỔNG nội bộ — (chưa có ảnh, dán vào đây)</w:t>
             </w:r>
           </w:p>
         </w:tc>
@@ -457,608 +1412,6 @@
     </w:p>
     <w:p>
       <w:pPr>
-        <w:spacing w:after="60" w:line="276" w:lineRule="auto"/>
-      </w:pPr>
-      <w:r>
-        <w:rPr>
-          <w:b/>
-          <w:color w:val="1B4D3E"/>
-          <w:sz w:val="26"/>
-          <w:szCs w:val="26"/>
-        </w:rPr>
-        <w:t xml:space="preserve">Bước 2.  </w:t>
-      </w:r>
-      <w:r>
-        <w:rPr>
-          <w:b/>
-          <w:sz w:val="26"/>
-          <w:szCs w:val="26"/>
-        </w:rPr>
-        <w:t xml:space="preserve">Chọn nguồn mủ</w:t>
-      </w:r>
-    </w:p>
-    <w:p>
-      <w:pPr>
-        <w:ind w:left="240"/>
-        <w:spacing w:after="80" w:line="276" w:lineRule="auto"/>
-      </w:pPr>
-      <w:r>
-        <w:rPr>
-          <w:b/>
-          <w:sz w:val="22"/>
-          <w:szCs w:val="22"/>
-        </w:rPr>
-        <w:t xml:space="preserve">• </w:t>
-      </w:r>
-      <w:r>
-        <w:rPr>
-          <w:sz w:val="22"/>
-          <w:szCs w:val="22"/>
-        </w:rPr>
-        <w:t xml:space="preserve">1 trong: Deal đã chốt / Đại lý trực tiếp / Nhà cung cấp.</w:t>
-      </w:r>
-    </w:p>
-    <w:tbl>
-      <w:tblPr>
-        <w:tblW w:w="9300" w:type="dxa"/>
-        <w:tblBorders>
-          <w:top w:val="dashed" w:sz="10" w:space="0" w:color="9CA3AF"/>
-          <w:left w:val="dashed" w:sz="10" w:space="0" w:color="9CA3AF"/>
-          <w:bottom w:val="dashed" w:sz="10" w:space="0" w:color="9CA3AF"/>
-          <w:right w:val="dashed" w:sz="10" w:space="0" w:color="9CA3AF"/>
-          <w:insideH w:val="dashed" w:sz="10" w:space="0" w:color="9CA3AF"/>
-          <w:insideV w:val="dashed" w:sz="10" w:space="0" w:color="9CA3AF"/>
-        </w:tblBorders>
-        <w:tblCellMar>
-          <w:top w:w="80" w:type="dxa"/>
-          <w:bottom w:w="80" w:type="dxa"/>
-        </w:tblCellMar>
-      </w:tblPr>
-      <w:tblGrid>
-        <w:gridCol w:w="9300"/>
-      </w:tblGrid>
-      <w:tr>
-        <w:trPr>
-          <w:trHeight w:val="2400"/>
-        </w:trPr>
-        <w:tc>
-          <w:tcPr>
-            <w:tcW w:w="9300" w:type="dxa"/>
-            <w:vAlign w:val="center"/>
-          </w:tcPr>
-          <w:p>
-            <w:pPr>
-              <w:jc w:val="center"/>
-              <w:spacing w:after="0"/>
-            </w:pPr>
-            <w:r>
-              <w:rPr>
-                <w:color w:val="9CA3AF"/>
-                <w:sz w:val="22"/>
-              </w:rPr>
-              <w:t xml:space="preserve">📷 Hình 4 — Màn hình chọn nguồn mủ</w:t>
-            </w:r>
-          </w:p>
-        </w:tc>
-      </w:tr>
-    </w:tbl>
-    <w:p>
-      <w:pPr>
-        <w:spacing w:after="160"/>
-      </w:pPr>
-    </w:p>
-    <w:p>
-      <w:pPr>
-        <w:spacing w:after="60" w:line="276" w:lineRule="auto"/>
-      </w:pPr>
-      <w:r>
-        <w:rPr>
-          <w:b/>
-          <w:color w:val="1B4D3E"/>
-          <w:sz w:val="26"/>
-          <w:szCs w:val="26"/>
-        </w:rPr>
-        <w:t xml:space="preserve">Bước 3.  </w:t>
-      </w:r>
-      <w:r>
-        <w:rPr>
-          <w:b/>
-          <w:sz w:val="26"/>
-          <w:szCs w:val="26"/>
-        </w:rPr>
-        <w:t xml:space="preserve">Chọn loại mủ</w:t>
-      </w:r>
-    </w:p>
-    <w:p>
-      <w:pPr>
-        <w:ind w:left="240"/>
-        <w:spacing w:after="80" w:line="276" w:lineRule="auto"/>
-      </w:pPr>
-      <w:r>
-        <w:rPr>
-          <w:b/>
-          <w:sz w:val="22"/>
-          <w:szCs w:val="22"/>
-        </w:rPr>
-        <w:t xml:space="preserve">• </w:t>
-      </w:r>
-      <w:r>
-        <w:rPr>
-          <w:sz w:val="22"/>
-          <w:szCs w:val="22"/>
-        </w:rPr>
-        <w:t xml:space="preserve">💧 Mủ nước · 🪨 Mủ tạp · 🥣 Mủ chén · 📄 Mủ tờ · 🟫 Mủ RSS3.</w:t>
-      </w:r>
-    </w:p>
-    <w:tbl>
-      <w:tblPr>
-        <w:tblW w:w="9300" w:type="dxa"/>
-        <w:tblBorders>
-          <w:top w:val="dashed" w:sz="10" w:space="0" w:color="9CA3AF"/>
-          <w:left w:val="dashed" w:sz="10" w:space="0" w:color="9CA3AF"/>
-          <w:bottom w:val="dashed" w:sz="10" w:space="0" w:color="9CA3AF"/>
-          <w:right w:val="dashed" w:sz="10" w:space="0" w:color="9CA3AF"/>
-          <w:insideH w:val="dashed" w:sz="10" w:space="0" w:color="9CA3AF"/>
-          <w:insideV w:val="dashed" w:sz="10" w:space="0" w:color="9CA3AF"/>
-        </w:tblBorders>
-        <w:tblCellMar>
-          <w:top w:w="80" w:type="dxa"/>
-          <w:bottom w:w="80" w:type="dxa"/>
-        </w:tblCellMar>
-      </w:tblPr>
-      <w:tblGrid>
-        <w:gridCol w:w="9300"/>
-      </w:tblGrid>
-      <w:tr>
-        <w:trPr>
-          <w:trHeight w:val="2400"/>
-        </w:trPr>
-        <w:tc>
-          <w:tcPr>
-            <w:tcW w:w="9300" w:type="dxa"/>
-            <w:vAlign w:val="center"/>
-          </w:tcPr>
-          <w:p>
-            <w:pPr>
-              <w:jc w:val="center"/>
-              <w:spacing w:after="0"/>
-            </w:pPr>
-            <w:r>
-              <w:rPr>
-                <w:color w:val="9CA3AF"/>
-                <w:sz w:val="22"/>
-              </w:rPr>
-              <w:t xml:space="preserve">📷 Hình 5 — Thanh chọn loại mủ</w:t>
-            </w:r>
-          </w:p>
-        </w:tc>
-      </w:tr>
-    </w:tbl>
-    <w:p>
-      <w:pPr>
-        <w:spacing w:after="160"/>
-      </w:pPr>
-    </w:p>
-    <w:p>
-      <w:pPr>
-        <w:spacing w:after="60" w:line="276" w:lineRule="auto"/>
-      </w:pPr>
-      <w:r>
-        <w:rPr>
-          <w:b/>
-          <w:color w:val="1B4D3E"/>
-          <w:sz w:val="26"/>
-          <w:szCs w:val="26"/>
-        </w:rPr>
-        <w:t xml:space="preserve">Bước 4.  </w:t>
-      </w:r>
-      <w:r>
-        <w:rPr>
-          <w:b/>
-          <w:sz w:val="26"/>
-          <w:szCs w:val="26"/>
-        </w:rPr>
-        <w:t xml:space="preserve">Nhập biển số xe + tài xế</w:t>
-      </w:r>
-    </w:p>
-    <w:tbl>
-      <w:tblPr>
-        <w:tblW w:w="9300" w:type="dxa"/>
-        <w:tblBorders>
-          <w:top w:val="dashed" w:sz="10" w:space="0" w:color="9CA3AF"/>
-          <w:left w:val="dashed" w:sz="10" w:space="0" w:color="9CA3AF"/>
-          <w:bottom w:val="dashed" w:sz="10" w:space="0" w:color="9CA3AF"/>
-          <w:right w:val="dashed" w:sz="10" w:space="0" w:color="9CA3AF"/>
-          <w:insideH w:val="dashed" w:sz="10" w:space="0" w:color="9CA3AF"/>
-          <w:insideV w:val="dashed" w:sz="10" w:space="0" w:color="9CA3AF"/>
-        </w:tblBorders>
-        <w:tblCellMar>
-          <w:top w:w="80" w:type="dxa"/>
-          <w:bottom w:w="80" w:type="dxa"/>
-        </w:tblCellMar>
-      </w:tblPr>
-      <w:tblGrid>
-        <w:gridCol w:w="9300"/>
-      </w:tblGrid>
-      <w:tr>
-        <w:trPr>
-          <w:trHeight w:val="2400"/>
-        </w:trPr>
-        <w:tc>
-          <w:tcPr>
-            <w:tcW w:w="9300" w:type="dxa"/>
-            <w:vAlign w:val="center"/>
-          </w:tcPr>
-          <w:p>
-            <w:pPr>
-              <w:jc w:val="center"/>
-              <w:spacing w:after="0"/>
-            </w:pPr>
-            <w:r>
-              <w:rPr>
-                <w:color w:val="9CA3AF"/>
-                <w:sz w:val="22"/>
-              </w:rPr>
-              <w:t xml:space="preserve">📷 Hình 6 — Ô nhập biển số xe + tài xế</w:t>
-            </w:r>
-          </w:p>
-        </w:tc>
-      </w:tr>
-    </w:tbl>
-    <w:p>
-      <w:pPr>
-        <w:spacing w:after="160"/>
-      </w:pPr>
-    </w:p>
-    <w:p>
-      <w:pPr>
-        <w:spacing w:after="60" w:line="276" w:lineRule="auto"/>
-      </w:pPr>
-      <w:r>
-        <w:rPr>
-          <w:b/>
-          <w:color w:val="1B4D3E"/>
-          <w:sz w:val="26"/>
-          <w:szCs w:val="26"/>
-        </w:rPr>
-        <w:t xml:space="preserve">Bước 5.  </w:t>
-      </w:r>
-      <w:r>
-        <w:rPr>
-          <w:b/>
-          <w:sz w:val="26"/>
-          <w:szCs w:val="26"/>
-        </w:rPr>
-        <w:t xml:space="preserve">Cân lần 1 — Gross (xe + hàng) + chụp 3 ảnh</w:t>
-      </w:r>
-    </w:p>
-    <w:p>
-      <w:pPr>
-        <w:ind w:left="240"/>
-        <w:spacing w:after="80" w:line="276" w:lineRule="auto"/>
-      </w:pPr>
-      <w:r>
-        <w:rPr>
-          <w:b/>
-          <w:sz w:val="22"/>
-          <w:szCs w:val="22"/>
-        </w:rPr>
-        <w:t xml:space="preserve">• </w:t>
-      </w:r>
-      <w:r>
-        <w:rPr>
-          <w:sz w:val="22"/>
-          <w:szCs w:val="22"/>
-        </w:rPr>
-        <w:t xml:space="preserve">Xe chở hàng lên cân → bấm Lấy số cân lần 1. Chụp đủ: Trước · Sau · Tài xế.</w:t>
-      </w:r>
-    </w:p>
-    <w:tbl>
-      <w:tblPr>
-        <w:tblW w:w="9300" w:type="dxa"/>
-        <w:tblBorders>
-          <w:top w:val="dashed" w:sz="10" w:space="0" w:color="9CA3AF"/>
-          <w:left w:val="dashed" w:sz="10" w:space="0" w:color="9CA3AF"/>
-          <w:bottom w:val="dashed" w:sz="10" w:space="0" w:color="9CA3AF"/>
-          <w:right w:val="dashed" w:sz="10" w:space="0" w:color="9CA3AF"/>
-          <w:insideH w:val="dashed" w:sz="10" w:space="0" w:color="9CA3AF"/>
-          <w:insideV w:val="dashed" w:sz="10" w:space="0" w:color="9CA3AF"/>
-        </w:tblBorders>
-        <w:tblCellMar>
-          <w:top w:w="80" w:type="dxa"/>
-          <w:bottom w:w="80" w:type="dxa"/>
-        </w:tblCellMar>
-      </w:tblPr>
-      <w:tblGrid>
-        <w:gridCol w:w="9300"/>
-      </w:tblGrid>
-      <w:tr>
-        <w:trPr>
-          <w:trHeight w:val="2800"/>
-        </w:trPr>
-        <w:tc>
-          <w:tcPr>
-            <w:tcW w:w="9300" w:type="dxa"/>
-            <w:vAlign w:val="center"/>
-          </w:tcPr>
-          <w:p>
-            <w:pPr>
-              <w:jc w:val="center"/>
-              <w:spacing w:after="0"/>
-            </w:pPr>
-            <w:r>
-              <w:rPr>
-                <w:color w:val="9CA3AF"/>
-                <w:sz w:val="22"/>
-              </w:rPr>
-              <w:t xml:space="preserve">📷 Hình 7 — Cân lần 1 + khu vực chụp 3 ảnh</w:t>
-            </w:r>
-          </w:p>
-        </w:tc>
-      </w:tr>
-    </w:tbl>
-    <w:p>
-      <w:pPr>
-        <w:spacing w:after="160"/>
-      </w:pPr>
-    </w:p>
-    <w:p>
-      <w:pPr>
-        <w:spacing w:after="60" w:line="276" w:lineRule="auto"/>
-      </w:pPr>
-      <w:r>
-        <w:rPr>
-          <w:b/>
-          <w:color w:val="1B4D3E"/>
-          <w:sz w:val="26"/>
-          <w:szCs w:val="26"/>
-        </w:rPr>
-        <w:t xml:space="preserve">Bước 6.  </w:t>
-      </w:r>
-      <w:r>
-        <w:rPr>
-          <w:b/>
-          <w:sz w:val="26"/>
-          <w:szCs w:val="26"/>
-        </w:rPr>
-        <w:t xml:space="preserve">Cân lần 2 — Tare (xe rỗng)</w:t>
-      </w:r>
-    </w:p>
-    <w:p>
-      <w:pPr>
-        <w:ind w:left="240"/>
-        <w:spacing w:after="80" w:line="276" w:lineRule="auto"/>
-      </w:pPr>
-      <w:r>
-        <w:rPr>
-          <w:b/>
-          <w:sz w:val="22"/>
-          <w:szCs w:val="22"/>
-        </w:rPr>
-        <w:t xml:space="preserve">• </w:t>
-      </w:r>
-      <w:r>
-        <w:rPr>
-          <w:sz w:val="22"/>
-          <w:szCs w:val="22"/>
-        </w:rPr>
-        <w:t xml:space="preserve">Đổ hàng xong, xe rỗng lên cân → bấm Lấy số cân lần 2. Net = Lần 1 − Lần 2.</w:t>
-      </w:r>
-    </w:p>
-    <w:tbl>
-      <w:tblPr>
-        <w:tblW w:w="9300" w:type="dxa"/>
-        <w:tblBorders>
-          <w:top w:val="dashed" w:sz="10" w:space="0" w:color="9CA3AF"/>
-          <w:left w:val="dashed" w:sz="10" w:space="0" w:color="9CA3AF"/>
-          <w:bottom w:val="dashed" w:sz="10" w:space="0" w:color="9CA3AF"/>
-          <w:right w:val="dashed" w:sz="10" w:space="0" w:color="9CA3AF"/>
-          <w:insideH w:val="dashed" w:sz="10" w:space="0" w:color="9CA3AF"/>
-          <w:insideV w:val="dashed" w:sz="10" w:space="0" w:color="9CA3AF"/>
-        </w:tblBorders>
-        <w:tblCellMar>
-          <w:top w:w="80" w:type="dxa"/>
-          <w:bottom w:w="80" w:type="dxa"/>
-        </w:tblCellMar>
-      </w:tblPr>
-      <w:tblGrid>
-        <w:gridCol w:w="9300"/>
-      </w:tblGrid>
-      <w:tr>
-        <w:trPr>
-          <w:trHeight w:val="2400"/>
-        </w:trPr>
-        <w:tc>
-          <w:tcPr>
-            <w:tcW w:w="9300" w:type="dxa"/>
-            <w:vAlign w:val="center"/>
-          </w:tcPr>
-          <w:p>
-            <w:pPr>
-              <w:jc w:val="center"/>
-              <w:spacing w:after="0"/>
-            </w:pPr>
-            <w:r>
-              <w:rPr>
-                <w:color w:val="9CA3AF"/>
-                <w:sz w:val="22"/>
-              </w:rPr>
-              <w:t xml:space="preserve">📷 Hình 8 — Cân lần 2 + kết quả Net</w:t>
-            </w:r>
-          </w:p>
-        </w:tc>
-      </w:tr>
-    </w:tbl>
-    <w:p>
-      <w:pPr>
-        <w:spacing w:after="160"/>
-      </w:pPr>
-    </w:p>
-    <w:p>
-      <w:pPr>
-        <w:spacing w:after="60" w:line="276" w:lineRule="auto"/>
-      </w:pPr>
-      <w:r>
-        <w:rPr>
-          <w:b/>
-          <w:color w:val="1B4D3E"/>
-          <w:sz w:val="26"/>
-          <w:szCs w:val="26"/>
-        </w:rPr>
-        <w:t xml:space="preserve">Bước 7.  </w:t>
-      </w:r>
-      <w:r>
-        <w:rPr>
-          <w:b/>
-          <w:sz w:val="26"/>
-          <w:szCs w:val="26"/>
-        </w:rPr>
-        <w:t xml:space="preserve">(Chỉ Mủ nước) Nhập DRC</w:t>
-      </w:r>
-    </w:p>
-    <w:tbl>
-      <w:tblPr>
-        <w:tblW w:w="9300" w:type="dxa"/>
-        <w:tblBorders>
-          <w:top w:val="dashed" w:sz="10" w:space="0" w:color="9CA3AF"/>
-          <w:left w:val="dashed" w:sz="10" w:space="0" w:color="9CA3AF"/>
-          <w:bottom w:val="dashed" w:sz="10" w:space="0" w:color="9CA3AF"/>
-          <w:right w:val="dashed" w:sz="10" w:space="0" w:color="9CA3AF"/>
-          <w:insideH w:val="dashed" w:sz="10" w:space="0" w:color="9CA3AF"/>
-          <w:insideV w:val="dashed" w:sz="10" w:space="0" w:color="9CA3AF"/>
-        </w:tblBorders>
-        <w:tblCellMar>
-          <w:top w:w="80" w:type="dxa"/>
-          <w:bottom w:w="80" w:type="dxa"/>
-        </w:tblCellMar>
-      </w:tblPr>
-      <w:tblGrid>
-        <w:gridCol w:w="9300"/>
-      </w:tblGrid>
-      <w:tr>
-        <w:trPr>
-          <w:trHeight w:val="2400"/>
-        </w:trPr>
-        <w:tc>
-          <w:tcPr>
-            <w:tcW w:w="9300" w:type="dxa"/>
-            <w:vAlign w:val="center"/>
-          </w:tcPr>
-          <w:p>
-            <w:pPr>
-              <w:jc w:val="center"/>
-              <w:spacing w:after="0"/>
-            </w:pPr>
-            <w:r>
-              <w:rPr>
-                <w:color w:val="9CA3AF"/>
-                <w:sz w:val="22"/>
-              </w:rPr>
-              <w:t xml:space="preserve">📷 Hình 9 — Ô nhập DRC</w:t>
-            </w:r>
-          </w:p>
-        </w:tc>
-      </w:tr>
-    </w:tbl>
-    <w:p>
-      <w:pPr>
-        <w:spacing w:after="160"/>
-      </w:pPr>
-    </w:p>
-    <w:p>
-      <w:pPr>
-        <w:spacing w:after="60" w:line="276" w:lineRule="auto"/>
-      </w:pPr>
-      <w:r>
-        <w:rPr>
-          <w:b/>
-          <w:color w:val="1B4D3E"/>
-          <w:sz w:val="26"/>
-          <w:szCs w:val="26"/>
-        </w:rPr>
-        <w:t xml:space="preserve">Bước 8.  </w:t>
-      </w:r>
-      <w:r>
-        <w:rPr>
-          <w:b/>
-          <w:sz w:val="26"/>
-          <w:szCs w:val="26"/>
-        </w:rPr>
-        <w:t xml:space="preserve">Hoàn tất + In phiếu</w:t>
-      </w:r>
-    </w:p>
-    <w:p>
-      <w:pPr>
-        <w:ind w:left="240"/>
-        <w:spacing w:after="80" w:line="276" w:lineRule="auto"/>
-      </w:pPr>
-      <w:r>
-        <w:rPr>
-          <w:b/>
-          <w:sz w:val="22"/>
-          <w:szCs w:val="22"/>
-        </w:rPr>
-        <w:t xml:space="preserve">• </w:t>
-      </w:r>
-      <w:r>
-        <w:rPr>
-          <w:sz w:val="22"/>
-          <w:szCs w:val="22"/>
-        </w:rPr>
-        <w:t xml:space="preserve">Kiểm lại loại mủ / biển số / số cân / ảnh → Hoàn tất → In (giao tài xế 1 bản).</w:t>
-      </w:r>
-    </w:p>
-    <w:tbl>
-      <w:tblPr>
-        <w:tblW w:w="9300" w:type="dxa"/>
-        <w:tblBorders>
-          <w:top w:val="dashed" w:sz="10" w:space="0" w:color="9CA3AF"/>
-          <w:left w:val="dashed" w:sz="10" w:space="0" w:color="9CA3AF"/>
-          <w:bottom w:val="dashed" w:sz="10" w:space="0" w:color="9CA3AF"/>
-          <w:right w:val="dashed" w:sz="10" w:space="0" w:color="9CA3AF"/>
-          <w:insideH w:val="dashed" w:sz="10" w:space="0" w:color="9CA3AF"/>
-          <w:insideV w:val="dashed" w:sz="10" w:space="0" w:color="9CA3AF"/>
-        </w:tblBorders>
-        <w:tblCellMar>
-          <w:top w:w="80" w:type="dxa"/>
-          <w:bottom w:w="80" w:type="dxa"/>
-        </w:tblCellMar>
-      </w:tblPr>
-      <w:tblGrid>
-        <w:gridCol w:w="9300"/>
-      </w:tblGrid>
-      <w:tr>
-        <w:trPr>
-          <w:trHeight w:val="3000"/>
-        </w:trPr>
-        <w:tc>
-          <w:tcPr>
-            <w:tcW w:w="9300" w:type="dxa"/>
-            <w:vAlign w:val="center"/>
-          </w:tcPr>
-          <w:p>
-            <w:pPr>
-              <w:jc w:val="center"/>
-              <w:spacing w:after="0"/>
-            </w:pPr>
-            <w:r>
-              <w:rPr>
-                <w:color w:val="9CA3AF"/>
-                <w:sz w:val="22"/>
-              </w:rPr>
-              <w:t xml:space="preserve">📷 Hình 10 — Phiếu cân in ra (mẫu)</w:t>
-            </w:r>
-          </w:p>
-        </w:tc>
-      </w:tr>
-    </w:tbl>
-    <w:p>
-      <w:pPr>
-        <w:spacing w:after="160"/>
-      </w:pPr>
-    </w:p>
-    <w:p>
-      <w:pPr>
         <w:spacing w:after="100" w:line="276" w:lineRule="auto"/>
       </w:pPr>
       <w:r>
@@ -1068,13 +1421,13 @@
           <w:sz w:val="28"/>
           <w:szCs w:val="28"/>
         </w:rPr>
-        <w:t xml:space="preserve">B. Cân XUẤT đi cảng (tóm tắt)</w:t>
+        <w:t xml:space="preserve">Lưu ý chung</w:t>
       </w:r>
     </w:p>
     <w:p>
       <w:pPr>
         <w:ind w:left="240"/>
-        <w:spacing w:after="80" w:line="276" w:lineRule="auto"/>
+        <w:spacing w:after="70" w:line="276" w:lineRule="auto"/>
       </w:pPr>
       <w:r>
         <w:rPr>
@@ -1089,13 +1442,13 @@
           <w:sz w:val="22"/>
           <w:szCs w:val="22"/>
         </w:rPr>
-        <w:t xml:space="preserve">Chọn XUẤT → chọn Lệnh điều động (Mã · Xe · Tài xế) → app tự điền xe/tài xế.</w:t>
+        <w:t xml:space="preserve">Chọn đúng loại mủ ngay từ đầu — tạo phiếu rồi KHÔNG sửa loại mủ trên app được (báo IT).</w:t>
       </w:r>
     </w:p>
     <w:p>
       <w:pPr>
         <w:ind w:left="240"/>
-        <w:spacing w:after="80" w:line="276" w:lineRule="auto"/>
+        <w:spacing w:after="70" w:line="276" w:lineRule="auto"/>
       </w:pPr>
       <w:r>
         <w:rPr>
@@ -1110,196 +1463,7 @@
           <w:sz w:val="22"/>
           <w:szCs w:val="22"/>
         </w:rPr>
-        <w:t xml:space="preserve">Cân Tare (xe rỗng) → Gross (xe + hàng) → xác nhận "Đã cân". Số cân đồng bộ về Lệnh + Đơn hàng.</w:t>
-      </w:r>
-    </w:p>
-    <w:tbl>
-      <w:tblPr>
-        <w:tblW w:w="9300" w:type="dxa"/>
-        <w:tblBorders>
-          <w:top w:val="dashed" w:sz="10" w:space="0" w:color="9CA3AF"/>
-          <w:left w:val="dashed" w:sz="10" w:space="0" w:color="9CA3AF"/>
-          <w:bottom w:val="dashed" w:sz="10" w:space="0" w:color="9CA3AF"/>
-          <w:right w:val="dashed" w:sz="10" w:space="0" w:color="9CA3AF"/>
-          <w:insideH w:val="dashed" w:sz="10" w:space="0" w:color="9CA3AF"/>
-          <w:insideV w:val="dashed" w:sz="10" w:space="0" w:color="9CA3AF"/>
-        </w:tblBorders>
-        <w:tblCellMar>
-          <w:top w:w="80" w:type="dxa"/>
-          <w:bottom w:w="80" w:type="dxa"/>
-        </w:tblCellMar>
-      </w:tblPr>
-      <w:tblGrid>
-        <w:gridCol w:w="9300"/>
-      </w:tblGrid>
-      <w:tr>
-        <w:trPr>
-          <w:trHeight w:val="2400"/>
-        </w:trPr>
-        <w:tc>
-          <w:tcPr>
-            <w:tcW w:w="9300" w:type="dxa"/>
-            <w:vAlign w:val="center"/>
-          </w:tcPr>
-          <w:p>
-            <w:pPr>
-              <w:jc w:val="center"/>
-              <w:spacing w:after="0"/>
-            </w:pPr>
-            <w:r>
-              <w:rPr>
-                <w:color w:val="9CA3AF"/>
-                <w:sz w:val="22"/>
-              </w:rPr>
-              <w:t xml:space="preserve">📷 Hình 11 — Cân xuất + chọn Lệnh điều động</w:t>
-            </w:r>
-          </w:p>
-        </w:tc>
-      </w:tr>
-    </w:tbl>
-    <w:p>
-      <w:pPr>
-        <w:spacing w:after="160"/>
-      </w:pPr>
-    </w:p>
-    <w:p>
-      <w:pPr>
-        <w:spacing w:after="100" w:line="276" w:lineRule="auto"/>
-      </w:pPr>
-      <w:r>
-        <w:rPr>
-          <w:b/>
-          <w:color w:val="1B4D3E"/>
-          <w:sz w:val="28"/>
-          <w:szCs w:val="28"/>
-        </w:rPr>
-        <w:t xml:space="preserve">C. Cân CỔNG nội bộ (tóm tắt)</w:t>
-      </w:r>
-    </w:p>
-    <w:p>
-      <w:pPr>
-        <w:ind w:left="240"/>
-        <w:spacing w:after="80" w:line="276" w:lineRule="auto"/>
-      </w:pPr>
-      <w:r>
-        <w:rPr>
-          <w:b/>
-          <w:sz w:val="22"/>
-          <w:szCs w:val="22"/>
-        </w:rPr>
-        <w:t xml:space="preserve">• </w:t>
-      </w:r>
-      <w:r>
-        <w:rPr>
-          <w:sz w:val="22"/>
-          <w:szCs w:val="22"/>
-        </w:rPr>
-        <w:t xml:space="preserve">Chọn CỔNG → cân vào → cân ra → chênh lệch = hàng. Không gắn đơn / nguồn mủ.</w:t>
-      </w:r>
-    </w:p>
-    <w:tbl>
-      <w:tblPr>
-        <w:tblW w:w="9300" w:type="dxa"/>
-        <w:tblBorders>
-          <w:top w:val="dashed" w:sz="10" w:space="0" w:color="9CA3AF"/>
-          <w:left w:val="dashed" w:sz="10" w:space="0" w:color="9CA3AF"/>
-          <w:bottom w:val="dashed" w:sz="10" w:space="0" w:color="9CA3AF"/>
-          <w:right w:val="dashed" w:sz="10" w:space="0" w:color="9CA3AF"/>
-          <w:insideH w:val="dashed" w:sz="10" w:space="0" w:color="9CA3AF"/>
-          <w:insideV w:val="dashed" w:sz="10" w:space="0" w:color="9CA3AF"/>
-        </w:tblBorders>
-        <w:tblCellMar>
-          <w:top w:w="80" w:type="dxa"/>
-          <w:bottom w:w="80" w:type="dxa"/>
-        </w:tblCellMar>
-      </w:tblPr>
-      <w:tblGrid>
-        <w:gridCol w:w="9300"/>
-      </w:tblGrid>
-      <w:tr>
-        <w:trPr>
-          <w:trHeight w:val="2400"/>
-        </w:trPr>
-        <w:tc>
-          <w:tcPr>
-            <w:tcW w:w="9300" w:type="dxa"/>
-            <w:vAlign w:val="center"/>
-          </w:tcPr>
-          <w:p>
-            <w:pPr>
-              <w:jc w:val="center"/>
-              <w:spacing w:after="0"/>
-            </w:pPr>
-            <w:r>
-              <w:rPr>
-                <w:color w:val="9CA3AF"/>
-                <w:sz w:val="22"/>
-              </w:rPr>
-              <w:t xml:space="preserve">📷 Hình 12 — Cân cổng nội bộ</w:t>
-            </w:r>
-          </w:p>
-        </w:tc>
-      </w:tr>
-    </w:tbl>
-    <w:p>
-      <w:pPr>
-        <w:spacing w:after="160"/>
-      </w:pPr>
-    </w:p>
-    <w:p>
-      <w:pPr>
-        <w:spacing w:after="100" w:line="276" w:lineRule="auto"/>
-      </w:pPr>
-      <w:r>
-        <w:rPr>
-          <w:b/>
-          <w:color w:val="1B4D3E"/>
-          <w:sz w:val="28"/>
-          <w:szCs w:val="28"/>
-        </w:rPr>
-        <w:t xml:space="preserve">Lưu ý chung</w:t>
-      </w:r>
-    </w:p>
-    <w:p>
-      <w:pPr>
-        <w:ind w:left="240"/>
-        <w:spacing w:after="80" w:line="276" w:lineRule="auto"/>
-      </w:pPr>
-      <w:r>
-        <w:rPr>
-          <w:b/>
-          <w:sz w:val="22"/>
-          <w:szCs w:val="22"/>
-        </w:rPr>
-        <w:t xml:space="preserve">• </w:t>
-      </w:r>
-      <w:r>
-        <w:rPr>
-          <w:sz w:val="22"/>
-          <w:szCs w:val="22"/>
-        </w:rPr>
-        <w:t xml:space="preserve">Chọn đúng loại mủ ngay từ đầu — tạo phiếu rồi KHÔNG sửa loại mủ trên app được (báo IT).</w:t>
-      </w:r>
-    </w:p>
-    <w:p>
-      <w:pPr>
-        <w:ind w:left="240"/>
-        <w:spacing w:after="80" w:line="276" w:lineRule="auto"/>
-      </w:pPr>
-      <w:r>
-        <w:rPr>
-          <w:b/>
-          <w:sz w:val="22"/>
-          <w:szCs w:val="22"/>
-        </w:rPr>
-        <w:t xml:space="preserve">• </w:t>
-      </w:r>
-      <w:r>
-        <w:rPr>
-          <w:sz w:val="22"/>
-          <w:szCs w:val="22"/>
-        </w:rPr>
-        <w:t xml:space="preserve">Phiếu cân dở nằm ở mục "Phiếu đang cân dở" → bấm "Tiếp tục" để cân lần 2.</w:t>
+        <w:t xml:space="preserve">Chụp ảnh rõ biển số. Cân xong nhớ IN PHIẾU giao tài xế.</w:t>
       </w:r>
     </w:p>
     <w:p>

</xml_diff>

<commit_message>
docs(weighbridge): embed last 3 screenshots — guide now complete
Adds weigh-1 (Gross + cân lần 2), DRC-at-scale (mủ nước), and CỔNG internal
screens; all 13 image boxes now filled, no dashed placeholders left.

Co-Authored-By: Claude Opus 4.8 <noreply@anthropic.com>
</commit_message>
<xml_diff>
--- a/public/huong-dan-can-phong-dien.docx
+++ b/public/huong-dan-can-phong-dien.docx
@@ -967,113 +967,6 @@
         <w:t xml:space="preserve">Xe chở hàng lên bàn cân → lấy số cân lần 1. Chụp đủ 3 ảnh: Trước xe · Sau xe · Tài xế.</w:t>
       </w:r>
     </w:p>
-    <w:tbl>
-      <w:tblPr>
-        <w:tblW w:w="9300" w:type="dxa"/>
-        <w:tblBorders>
-          <w:top w:val="dashed" w:sz="10" w:space="0" w:color="9CA3AF"/>
-          <w:left w:val="dashed" w:sz="10" w:space="0" w:color="9CA3AF"/>
-          <w:bottom w:val="dashed" w:sz="10" w:space="0" w:color="9CA3AF"/>
-          <w:right w:val="dashed" w:sz="10" w:space="0" w:color="9CA3AF"/>
-        </w:tblBorders>
-      </w:tblPr>
-      <w:tblGrid>
-        <w:gridCol w:w="9300"/>
-      </w:tblGrid>
-      <w:tr>
-        <w:trPr>
-          <w:trHeight w:val="2600"/>
-        </w:trPr>
-        <w:tc>
-          <w:tcPr>
-            <w:tcW w:w="9300" w:type="dxa"/>
-            <w:vAlign w:val="center"/>
-          </w:tcPr>
-          <w:p>
-            <w:pPr>
-              <w:jc w:val="center"/>
-              <w:spacing w:after="0"/>
-            </w:pPr>
-            <w:r>
-              <w:rPr>
-                <w:color w:val="9CA3AF"/>
-                <w:sz w:val="22"/>
-              </w:rPr>
-              <w:t xml:space="preserve">📷 Màn hình cân lần 1 (Gross) + chụp ảnh — (chưa có ảnh, dán vào đây)</w:t>
-            </w:r>
-          </w:p>
-        </w:tc>
-      </w:tr>
-    </w:tbl>
-    <w:p>
-      <w:pPr>
-        <w:spacing w:after="160"/>
-      </w:pPr>
-    </w:p>
-    <w:p>
-      <w:pPr>
-        <w:spacing w:after="50" w:line="276" w:lineRule="auto"/>
-      </w:pPr>
-      <w:r>
-        <w:rPr>
-          <w:b/>
-          <w:color w:val="1B4D3E"/>
-          <w:sz w:val="26"/>
-          <w:szCs w:val="26"/>
-        </w:rPr>
-        <w:t xml:space="preserve">Bước 8.  </w:t>
-      </w:r>
-      <w:r>
-        <w:rPr>
-          <w:b/>
-          <w:sz w:val="26"/>
-          <w:szCs w:val="26"/>
-        </w:rPr>
-        <w:t xml:space="preserve">Cân lần 2 — Tare (xe rỗng) → Net → Hoàn tất → IN PHIẾU</w:t>
-      </w:r>
-    </w:p>
-    <w:p>
-      <w:pPr>
-        <w:ind w:left="240"/>
-        <w:spacing w:after="70" w:line="276" w:lineRule="auto"/>
-      </w:pPr>
-      <w:r>
-        <w:rPr>
-          <w:b/>
-          <w:sz w:val="22"/>
-          <w:szCs w:val="22"/>
-        </w:rPr>
-        <w:t xml:space="preserve">• </w:t>
-      </w:r>
-      <w:r>
-        <w:rPr>
-          <w:sz w:val="22"/>
-          <w:szCs w:val="22"/>
-        </w:rPr>
-        <w:t xml:space="preserve">Đổ hàng xong, xe rỗng lên cân → lấy số cân lần 2. Hệ thống ra NET = Lần 1 − Lần 2.</w:t>
-      </w:r>
-    </w:p>
-    <w:p>
-      <w:pPr>
-        <w:ind w:left="240"/>
-        <w:spacing w:after="70" w:line="276" w:lineRule="auto"/>
-      </w:pPr>
-      <w:r>
-        <w:rPr>
-          <w:b/>
-          <w:sz w:val="22"/>
-          <w:szCs w:val="22"/>
-        </w:rPr>
-        <w:t xml:space="preserve">• </w:t>
-      </w:r>
-      <w:r>
-        <w:rPr>
-          <w:sz w:val="22"/>
-          <w:szCs w:val="22"/>
-        </w:rPr>
-        <w:t xml:space="preserve">Kiểm lại → bấm Hoàn tất → bấm IN PHIẾU (giao tài xế 1 bản).</w:t>
-      </w:r>
-    </w:p>
     <w:p>
       <w:pPr>
         <w:jc w:val="center"/>
@@ -1082,7 +975,7 @@
       <w:r>
         <w:drawing>
           <wp:inline xmlns:wp="http://schemas.openxmlformats.org/drawingml/2006/wordprocessingDrawing" distT="0" distB="0" distL="0" distR="0">
-            <wp:extent cx="5850000" cy="3733649"/>
+            <wp:extent cx="5850000" cy="3510000"/>
             <wp:effectExtent l="0" t="0" r="0" b="0"/>
             <wp:docPr id="108" name="Picture 108"/>
             <wp:cNvGraphicFramePr>
@@ -1104,7 +997,7 @@
                   <pic:spPr>
                     <a:xfrm>
                       <a:off x="0" y="0"/>
-                      <a:ext cx="5850000" cy="3733649"/>
+                      <a:ext cx="5850000" cy="3510000"/>
                     </a:xfrm>
                     <a:prstGeom prst="rect">
                       <a:avLst/>
@@ -1129,7 +1022,7 @@
           <w:sz w:val="18"/>
           <w:szCs w:val="18"/>
         </w:rPr>
-        <w:t xml:space="preserve">Phiếu hoàn tất — Net + 3 ảnh + nút IN PHIẾU</w:t>
+        <w:t xml:space="preserve">Màn hình cân — Cân lần 1 (Gross) xong, sang Cân lần 2</w:t>
       </w:r>
     </w:p>
     <w:p>
@@ -1143,7 +1036,7 @@
           <w:sz w:val="26"/>
           <w:szCs w:val="26"/>
         </w:rPr>
-        <w:t xml:space="preserve">Bước 9.  </w:t>
+        <w:t xml:space="preserve">Bước 8.  </w:t>
       </w:r>
       <w:r>
         <w:rPr>
@@ -1151,7 +1044,7 @@
           <w:sz w:val="26"/>
           <w:szCs w:val="26"/>
         </w:rPr>
-        <w:t xml:space="preserve">(Chỉ Mủ nước) Nhập DRC</w:t>
+        <w:t xml:space="preserve">Cân lần 2 — Tare (xe rỗng) → Net → Hoàn tất → IN PHIẾU</w:t>
       </w:r>
     </w:p>
     <w:p>
@@ -1172,64 +1065,7 @@
           <w:sz w:val="22"/>
           <w:szCs w:val="22"/>
         </w:rPr>
-        <w:t xml:space="preserve">Với mủ nước: nhập/tra DRC% để ra khối lượng khô + thành tiền.</w:t>
-      </w:r>
-    </w:p>
-    <w:tbl>
-      <w:tblPr>
-        <w:tblW w:w="9300" w:type="dxa"/>
-        <w:tblBorders>
-          <w:top w:val="dashed" w:sz="10" w:space="0" w:color="9CA3AF"/>
-          <w:left w:val="dashed" w:sz="10" w:space="0" w:color="9CA3AF"/>
-          <w:bottom w:val="dashed" w:sz="10" w:space="0" w:color="9CA3AF"/>
-          <w:right w:val="dashed" w:sz="10" w:space="0" w:color="9CA3AF"/>
-        </w:tblBorders>
-      </w:tblPr>
-      <w:tblGrid>
-        <w:gridCol w:w="9300"/>
-      </w:tblGrid>
-      <w:tr>
-        <w:trPr>
-          <w:trHeight w:val="1400"/>
-        </w:trPr>
-        <w:tc>
-          <w:tcPr>
-            <w:tcW w:w="9300" w:type="dxa"/>
-            <w:vAlign w:val="center"/>
-          </w:tcPr>
-          <w:p>
-            <w:pPr>
-              <w:jc w:val="center"/>
-              <w:spacing w:after="0"/>
-            </w:pPr>
-            <w:r>
-              <w:rPr>
-                <w:color w:val="9CA3AF"/>
-                <w:sz w:val="22"/>
-              </w:rPr>
-              <w:t xml:space="preserve">📷 Ô nhập DRC (chỉ hiện với Mủ nước) — (chưa có ảnh, dán vào đây)</w:t>
-            </w:r>
-          </w:p>
-        </w:tc>
-      </w:tr>
-    </w:tbl>
-    <w:p>
-      <w:pPr>
-        <w:spacing w:after="160"/>
-      </w:pPr>
-    </w:p>
-    <w:p>
-      <w:pPr>
-        <w:spacing w:after="100" w:line="276" w:lineRule="auto"/>
-      </w:pPr>
-      <w:r>
-        <w:rPr>
-          <w:b/>
-          <w:color w:val="1B4D3E"/>
-          <w:sz w:val="28"/>
-          <w:szCs w:val="28"/>
-        </w:rPr>
-        <w:t xml:space="preserve">B. Cân XUẤT đi cảng</w:t>
+        <w:t xml:space="preserve">Đổ hàng xong, xe rỗng lên cân → lấy số cân lần 2. Hệ thống ra NET = Lần 1 − Lần 2.</w:t>
       </w:r>
     </w:p>
     <w:p>
@@ -1250,28 +1086,7 @@
           <w:sz w:val="22"/>
           <w:szCs w:val="22"/>
         </w:rPr>
-        <w:t xml:space="preserve">Chọn loại phiếu = XUẤT → chọn Lệnh điều động (Mã · Xe · Tài xế) → app TỰ ĐIỀN xe/tài xế + hiện container của lệnh.</w:t>
-      </w:r>
-    </w:p>
-    <w:p>
-      <w:pPr>
-        <w:ind w:left="240"/>
-        <w:spacing w:after="70" w:line="276" w:lineRule="auto"/>
-      </w:pPr>
-      <w:r>
-        <w:rPr>
-          <w:b/>
-          <w:sz w:val="22"/>
-          <w:szCs w:val="22"/>
-        </w:rPr>
-        <w:t xml:space="preserve">• </w:t>
-      </w:r>
-      <w:r>
-        <w:rPr>
-          <w:sz w:val="22"/>
-          <w:szCs w:val="22"/>
-        </w:rPr>
-        <w:t xml:space="preserve">Cân Tare (xe rỗng) → Gross (xe + hàng) → Hoàn tất ("Đã cân"). Số cân tự đồng bộ về Lệnh điều động + Đơn hàng bán.</w:t>
+        <w:t xml:space="preserve">Kiểm lại → bấm Hoàn tất → bấm IN PHIẾU (giao tài xế 1 bản).</w:t>
       </w:r>
     </w:p>
     <w:p>
@@ -1282,7 +1097,7 @@
       <w:r>
         <w:drawing>
           <wp:inline xmlns:wp="http://schemas.openxmlformats.org/drawingml/2006/wordprocessingDrawing" distT="0" distB="0" distL="0" distR="0">
-            <wp:extent cx="5850000" cy="3255410"/>
+            <wp:extent cx="5850000" cy="3733649"/>
             <wp:effectExtent l="0" t="0" r="0" b="0"/>
             <wp:docPr id="109" name="Picture 109"/>
             <wp:cNvGraphicFramePr>
@@ -1304,6 +1119,221 @@
                   <pic:spPr>
                     <a:xfrm>
                       <a:off x="0" y="0"/>
+                      <a:ext cx="5850000" cy="3733649"/>
+                    </a:xfrm>
+                    <a:prstGeom prst="rect">
+                      <a:avLst/>
+                    </a:prstGeom>
+                  </pic:spPr>
+                </pic:pic>
+              </a:graphicData>
+            </a:graphic>
+          </wp:inline>
+        </w:drawing>
+      </w:r>
+    </w:p>
+    <w:p>
+      <w:pPr>
+        <w:jc w:val="center"/>
+        <w:spacing w:after="200" w:line="276" w:lineRule="auto"/>
+      </w:pPr>
+      <w:r>
+        <w:rPr>
+          <w:i/>
+          <w:color w:val="9CA3AF"/>
+          <w:sz w:val="18"/>
+          <w:szCs w:val="18"/>
+        </w:rPr>
+        <w:t xml:space="preserve">Phiếu hoàn tất — Net + 3 ảnh + nút IN PHIẾU</w:t>
+      </w:r>
+    </w:p>
+    <w:p>
+      <w:pPr>
+        <w:spacing w:after="50" w:line="276" w:lineRule="auto"/>
+      </w:pPr>
+      <w:r>
+        <w:rPr>
+          <w:b/>
+          <w:color w:val="1B4D3E"/>
+          <w:sz w:val="26"/>
+          <w:szCs w:val="26"/>
+        </w:rPr>
+        <w:t xml:space="preserve">Bước 9.  </w:t>
+      </w:r>
+      <w:r>
+        <w:rPr>
+          <w:b/>
+          <w:sz w:val="26"/>
+          <w:szCs w:val="26"/>
+        </w:rPr>
+        <w:t xml:space="preserve">(Chỉ Mủ nước) Nhập DRC</w:t>
+      </w:r>
+    </w:p>
+    <w:p>
+      <w:pPr>
+        <w:ind w:left="240"/>
+        <w:spacing w:after="70" w:line="276" w:lineRule="auto"/>
+      </w:pPr>
+      <w:r>
+        <w:rPr>
+          <w:b/>
+          <w:sz w:val="22"/>
+          <w:szCs w:val="22"/>
+        </w:rPr>
+        <w:t xml:space="preserve">• </w:t>
+      </w:r>
+      <w:r>
+        <w:rPr>
+          <w:sz w:val="22"/>
+          <w:szCs w:val="22"/>
+        </w:rPr>
+        <w:t xml:space="preserve">Với mủ nước: nhập/tra DRC% để ra khối lượng khô + thành tiền.</w:t>
+      </w:r>
+    </w:p>
+    <w:p>
+      <w:pPr>
+        <w:jc w:val="center"/>
+        <w:spacing w:after="60"/>
+      </w:pPr>
+      <w:r>
+        <w:drawing>
+          <wp:inline xmlns:wp="http://schemas.openxmlformats.org/drawingml/2006/wordprocessingDrawing" distT="0" distB="0" distL="0" distR="0">
+            <wp:extent cx="5850000" cy="1905882"/>
+            <wp:effectExtent l="0" t="0" r="0" b="0"/>
+            <wp:docPr id="110" name="Picture 110"/>
+            <wp:cNvGraphicFramePr>
+              <a:graphicFrameLocks xmlns:a="http://schemas.openxmlformats.org/drawingml/2006/main" noChangeAspect="1"/>
+            </wp:cNvGraphicFramePr>
+            <a:graphic xmlns:a="http://schemas.openxmlformats.org/drawingml/2006/main">
+              <a:graphicData uri="http://schemas.openxmlformats.org/drawingml/2006/picture">
+                <pic:pic xmlns:pic="http://schemas.openxmlformats.org/drawingml/2006/picture">
+                  <pic:nvPicPr>
+                    <pic:cNvPr id="110" name="img110"/>
+                    <pic:cNvPicPr/>
+                  </pic:nvPicPr>
+                  <pic:blipFill>
+                    <a:blip r:embed="rIdImg910"/>
+                    <a:stretch>
+                      <a:fillRect/>
+                    </a:stretch>
+                  </pic:blipFill>
+                  <pic:spPr>
+                    <a:xfrm>
+                      <a:off x="0" y="0"/>
+                      <a:ext cx="5850000" cy="1905882"/>
+                    </a:xfrm>
+                    <a:prstGeom prst="rect">
+                      <a:avLst/>
+                    </a:prstGeom>
+                  </pic:spPr>
+                </pic:pic>
+              </a:graphicData>
+            </a:graphic>
+          </wp:inline>
+        </w:drawing>
+      </w:r>
+    </w:p>
+    <w:p>
+      <w:pPr>
+        <w:jc w:val="center"/>
+        <w:spacing w:after="200" w:line="276" w:lineRule="auto"/>
+      </w:pPr>
+      <w:r>
+        <w:rPr>
+          <w:i/>
+          <w:color w:val="9CA3AF"/>
+          <w:sz w:val="18"/>
+          <w:szCs w:val="18"/>
+        </w:rPr>
+        <w:t xml:space="preserve">Ô đo DRC tại cân (chỉ hiện với Mủ nước)</w:t>
+      </w:r>
+    </w:p>
+    <w:p>
+      <w:pPr>
+        <w:spacing w:after="100" w:line="276" w:lineRule="auto"/>
+      </w:pPr>
+      <w:r>
+        <w:rPr>
+          <w:b/>
+          <w:color w:val="1B4D3E"/>
+          <w:sz w:val="28"/>
+          <w:szCs w:val="28"/>
+        </w:rPr>
+        <w:t xml:space="preserve">B. Cân XUẤT đi cảng</w:t>
+      </w:r>
+    </w:p>
+    <w:p>
+      <w:pPr>
+        <w:ind w:left="240"/>
+        <w:spacing w:after="70" w:line="276" w:lineRule="auto"/>
+      </w:pPr>
+      <w:r>
+        <w:rPr>
+          <w:b/>
+          <w:sz w:val="22"/>
+          <w:szCs w:val="22"/>
+        </w:rPr>
+        <w:t xml:space="preserve">• </w:t>
+      </w:r>
+      <w:r>
+        <w:rPr>
+          <w:sz w:val="22"/>
+          <w:szCs w:val="22"/>
+        </w:rPr>
+        <w:t xml:space="preserve">Chọn loại phiếu = XUẤT → chọn Lệnh điều động (Mã · Xe · Tài xế) → app TỰ ĐIỀN xe/tài xế + hiện container của lệnh.</w:t>
+      </w:r>
+    </w:p>
+    <w:p>
+      <w:pPr>
+        <w:ind w:left="240"/>
+        <w:spacing w:after="70" w:line="276" w:lineRule="auto"/>
+      </w:pPr>
+      <w:r>
+        <w:rPr>
+          <w:b/>
+          <w:sz w:val="22"/>
+          <w:szCs w:val="22"/>
+        </w:rPr>
+        <w:t xml:space="preserve">• </w:t>
+      </w:r>
+      <w:r>
+        <w:rPr>
+          <w:sz w:val="22"/>
+          <w:szCs w:val="22"/>
+        </w:rPr>
+        <w:t xml:space="preserve">Cân Tare (xe rỗng) → Gross (xe + hàng) → Hoàn tất ("Đã cân"). Số cân tự đồng bộ về Lệnh điều động + Đơn hàng bán.</w:t>
+      </w:r>
+    </w:p>
+    <w:p>
+      <w:pPr>
+        <w:jc w:val="center"/>
+        <w:spacing w:after="60"/>
+      </w:pPr>
+      <w:r>
+        <w:drawing>
+          <wp:inline xmlns:wp="http://schemas.openxmlformats.org/drawingml/2006/wordprocessingDrawing" distT="0" distB="0" distL="0" distR="0">
+            <wp:extent cx="5850000" cy="3255410"/>
+            <wp:effectExtent l="0" t="0" r="0" b="0"/>
+            <wp:docPr id="111" name="Picture 111"/>
+            <wp:cNvGraphicFramePr>
+              <a:graphicFrameLocks xmlns:a="http://schemas.openxmlformats.org/drawingml/2006/main" noChangeAspect="1"/>
+            </wp:cNvGraphicFramePr>
+            <a:graphic xmlns:a="http://schemas.openxmlformats.org/drawingml/2006/main">
+              <a:graphicData uri="http://schemas.openxmlformats.org/drawingml/2006/picture">
+                <pic:pic xmlns:pic="http://schemas.openxmlformats.org/drawingml/2006/picture">
+                  <pic:nvPicPr>
+                    <pic:cNvPr id="111" name="img111"/>
+                    <pic:cNvPicPr/>
+                  </pic:nvPicPr>
+                  <pic:blipFill>
+                    <a:blip r:embed="rIdImg911"/>
+                    <a:stretch>
+                      <a:fillRect/>
+                    </a:stretch>
+                  </pic:blipFill>
+                  <pic:spPr>
+                    <a:xfrm>
+                      <a:off x="0" y="0"/>
                       <a:ext cx="5850000" cy="3255410"/>
                     </a:xfrm>
                     <a:prstGeom prst="rect">
@@ -1364,51 +1394,66 @@
           <w:sz w:val="22"/>
           <w:szCs w:val="22"/>
         </w:rPr>
-        <w:t xml:space="preserve">Chọn loại phiếu = CỔNG → cân vào → cân ra → chênh lệch = hàng. Không gắn đơn / nguồn mủ.</w:t>
-      </w:r>
-    </w:p>
-    <w:tbl>
-      <w:tblPr>
-        <w:tblW w:w="9300" w:type="dxa"/>
-        <w:tblBorders>
-          <w:top w:val="dashed" w:sz="10" w:space="0" w:color="9CA3AF"/>
-          <w:left w:val="dashed" w:sz="10" w:space="0" w:color="9CA3AF"/>
-          <w:bottom w:val="dashed" w:sz="10" w:space="0" w:color="9CA3AF"/>
-          <w:right w:val="dashed" w:sz="10" w:space="0" w:color="9CA3AF"/>
-        </w:tblBorders>
-      </w:tblPr>
-      <w:tblGrid>
-        <w:gridCol w:w="9300"/>
-      </w:tblGrid>
-      <w:tr>
-        <w:trPr>
-          <w:trHeight w:val="2000"/>
-        </w:trPr>
-        <w:tc>
-          <w:tcPr>
-            <w:tcW w:w="9300" w:type="dxa"/>
-            <w:vAlign w:val="center"/>
-          </w:tcPr>
-          <w:p>
-            <w:pPr>
-              <w:jc w:val="center"/>
-              <w:spacing w:after="0"/>
-            </w:pPr>
-            <w:r>
-              <w:rPr>
-                <w:color w:val="9CA3AF"/>
-                <w:sz w:val="22"/>
-              </w:rPr>
-              <w:t xml:space="preserve">📷 Màn hình cân CỔNG nội bộ — (chưa có ảnh, dán vào đây)</w:t>
-            </w:r>
-          </w:p>
-        </w:tc>
-      </w:tr>
-    </w:tbl>
-    <w:p>
-      <w:pPr>
-        <w:spacing w:after="160"/>
-      </w:pPr>
+        <w:t xml:space="preserve">Chọn loại phiếu = CỔNG → ghi Nội dung hàng (vật tư, phế liệu, thành phẩm nội bộ…) → cân vào → cân ra → chênh lệch = hàng. Không gắn đơn / nguồn mủ.</w:t>
+      </w:r>
+    </w:p>
+    <w:p>
+      <w:pPr>
+        <w:jc w:val="center"/>
+        <w:spacing w:after="60"/>
+      </w:pPr>
+      <w:r>
+        <w:drawing>
+          <wp:inline xmlns:wp="http://schemas.openxmlformats.org/drawingml/2006/wordprocessingDrawing" distT="0" distB="0" distL="0" distR="0">
+            <wp:extent cx="5850000" cy="2832482"/>
+            <wp:effectExtent l="0" t="0" r="0" b="0"/>
+            <wp:docPr id="112" name="Picture 112"/>
+            <wp:cNvGraphicFramePr>
+              <a:graphicFrameLocks xmlns:a="http://schemas.openxmlformats.org/drawingml/2006/main" noChangeAspect="1"/>
+            </wp:cNvGraphicFramePr>
+            <a:graphic xmlns:a="http://schemas.openxmlformats.org/drawingml/2006/main">
+              <a:graphicData uri="http://schemas.openxmlformats.org/drawingml/2006/picture">
+                <pic:pic xmlns:pic="http://schemas.openxmlformats.org/drawingml/2006/picture">
+                  <pic:nvPicPr>
+                    <pic:cNvPr id="112" name="img112"/>
+                    <pic:cNvPicPr/>
+                  </pic:nvPicPr>
+                  <pic:blipFill>
+                    <a:blip r:embed="rIdImg912"/>
+                    <a:stretch>
+                      <a:fillRect/>
+                    </a:stretch>
+                  </pic:blipFill>
+                  <pic:spPr>
+                    <a:xfrm>
+                      <a:off x="0" y="0"/>
+                      <a:ext cx="5850000" cy="2832482"/>
+                    </a:xfrm>
+                    <a:prstGeom prst="rect">
+                      <a:avLst/>
+                    </a:prstGeom>
+                  </pic:spPr>
+                </pic:pic>
+              </a:graphicData>
+            </a:graphic>
+          </wp:inline>
+        </w:drawing>
+      </w:r>
+    </w:p>
+    <w:p>
+      <w:pPr>
+        <w:jc w:val="center"/>
+        <w:spacing w:after="200" w:line="276" w:lineRule="auto"/>
+      </w:pPr>
+      <w:r>
+        <w:rPr>
+          <w:i/>
+          <w:color w:val="9CA3AF"/>
+          <w:sz w:val="18"/>
+          <w:szCs w:val="18"/>
+        </w:rPr>
+        <w:t xml:space="preserve">Màn hình cân CỔNG nội bộ</w:t>
+      </w:r>
     </w:p>
     <w:p>
       <w:pPr>

</xml_diff>